<commit_message>
Add TISS/APACHE vs NAS rationale to meeting brief and director summary
Co-Authored-By: Claude Opus 5.5 <noreply@anthropic.com>
Claude-Session: https://claude.ai/code/session_017upeArPjxTak4ieM8E5m6y
</commit_message>
<xml_diff>
--- a/nursing-workload-proposal/護理主管會議討論稿_v0.1.docx
+++ b/nursing-workload-proposal/護理主管會議討論稿_v0.1.docx
@@ -1185,7 +1185,463 @@
           <w:sz w:val="28"/>
           <w:szCs w:val="28"/>
         </w:rPr>
-        <w:t xml:space="preserve">六、說法上的提醒</w:t>
+        <w:t xml:space="preserve">六、加護病房：為什麼現行 TISS／APACHE 反映不出護理負擔</w:t>
+      </w:r>
+    </w:p>
+    <w:tbl>
+      <w:tblPr>
+        <w:tblW w:type="dxa" w:w="9600"/>
+        <w:tblBorders>
+          <w:top w:val="single" w:color="auto" w:sz="4"/>
+          <w:left w:val="single" w:color="auto" w:sz="4"/>
+          <w:bottom w:val="single" w:color="auto" w:sz="4"/>
+          <w:right w:val="single" w:color="auto" w:sz="4"/>
+          <w:insideH w:val="single" w:color="auto" w:sz="4"/>
+          <w:insideV w:val="single" w:color="auto" w:sz="4"/>
+        </w:tblBorders>
+      </w:tblPr>
+      <w:tblGrid>
+        <w:gridCol w:w="2000"/>
+        <w:gridCol w:w="3600"/>
+        <w:gridCol w:w="4000"/>
+      </w:tblGrid>
+      <w:tr>
+        <w:tc>
+          <w:tcPr>
+            <w:tcW w:type="dxa" w:w="2000"/>
+            <w:tcBorders>
+              <w:top w:val="single" w:color="999999" w:sz="4"/>
+              <w:left w:val="single" w:color="999999" w:sz="4"/>
+              <w:bottom w:val="single" w:color="999999" w:sz="4"/>
+              <w:right w:val="single" w:color="999999" w:sz="4"/>
+            </w:tcBorders>
+            <w:shd w:fill="D9E1F2" w:color="auto" w:val="clear"/>
+            <w:tcMar>
+              <w:top w:type="dxa" w:w="60"/>
+              <w:left w:type="dxa" w:w="100"/>
+              <w:bottom w:type="dxa" w:w="60"/>
+              <w:right w:type="dxa" w:w="100"/>
+            </w:tcMar>
+          </w:tcPr>
+          <w:p>
+            <w:r>
+              <w:rPr>
+                <w:rFonts w:ascii="Times New Roman" w:cs="Times New Roman" w:eastAsia="標楷體" w:hAnsi="Times New Roman"/>
+                <w:b/>
+                <w:bCs/>
+                <w:sz w:val="22"/>
+                <w:szCs w:val="22"/>
+              </w:rPr>
+              <w:t xml:space="preserve">工具</w:t>
+            </w:r>
+          </w:p>
+        </w:tc>
+        <w:tc>
+          <w:tcPr>
+            <w:tcW w:type="dxa" w:w="3600"/>
+            <w:tcBorders>
+              <w:top w:val="single" w:color="999999" w:sz="4"/>
+              <w:left w:val="single" w:color="999999" w:sz="4"/>
+              <w:bottom w:val="single" w:color="999999" w:sz="4"/>
+              <w:right w:val="single" w:color="999999" w:sz="4"/>
+            </w:tcBorders>
+            <w:shd w:fill="D9E1F2" w:color="auto" w:val="clear"/>
+            <w:tcMar>
+              <w:top w:type="dxa" w:w="60"/>
+              <w:left w:type="dxa" w:w="100"/>
+              <w:bottom w:type="dxa" w:w="60"/>
+              <w:right w:type="dxa" w:w="100"/>
+            </w:tcMar>
+          </w:tcPr>
+          <w:p>
+            <w:r>
+              <w:rPr>
+                <w:rFonts w:ascii="Times New Roman" w:cs="Times New Roman" w:eastAsia="標楷體" w:hAnsi="Times New Roman"/>
+                <w:b/>
+                <w:bCs/>
+                <w:sz w:val="22"/>
+                <w:szCs w:val="22"/>
+              </w:rPr>
+              <w:t xml:space="preserve">量的是什麼</w:t>
+            </w:r>
+          </w:p>
+        </w:tc>
+        <w:tc>
+          <w:tcPr>
+            <w:tcW w:type="dxa" w:w="4000"/>
+            <w:tcBorders>
+              <w:top w:val="single" w:color="999999" w:sz="4"/>
+              <w:left w:val="single" w:color="999999" w:sz="4"/>
+              <w:bottom w:val="single" w:color="999999" w:sz="4"/>
+              <w:right w:val="single" w:color="999999" w:sz="4"/>
+            </w:tcBorders>
+            <w:shd w:fill="D9E1F2" w:color="auto" w:val="clear"/>
+            <w:tcMar>
+              <w:top w:type="dxa" w:w="60"/>
+              <w:left w:type="dxa" w:w="100"/>
+              <w:bottom w:type="dxa" w:w="60"/>
+              <w:right w:type="dxa" w:w="100"/>
+            </w:tcMar>
+          </w:tcPr>
+          <w:p>
+            <w:r>
+              <w:rPr>
+                <w:rFonts w:ascii="Times New Roman" w:cs="Times New Roman" w:eastAsia="標楷體" w:hAnsi="Times New Roman"/>
+                <w:b/>
+                <w:bCs/>
+                <w:sz w:val="22"/>
+                <w:szCs w:val="22"/>
+              </w:rPr>
+              <w:t xml:space="preserve">看不到的護理工作</w:t>
+            </w:r>
+          </w:p>
+        </w:tc>
+      </w:tr>
+      <w:tr>
+        <w:tc>
+          <w:tcPr>
+            <w:tcW w:type="dxa" w:w="2000"/>
+            <w:tcBorders>
+              <w:top w:val="single" w:color="999999" w:sz="4"/>
+              <w:left w:val="single" w:color="999999" w:sz="4"/>
+              <w:bottom w:val="single" w:color="999999" w:sz="4"/>
+              <w:right w:val="single" w:color="999999" w:sz="4"/>
+            </w:tcBorders>
+            <w:tcMar>
+              <w:top w:type="dxa" w:w="60"/>
+              <w:left w:type="dxa" w:w="100"/>
+              <w:bottom w:type="dxa" w:w="60"/>
+              <w:right w:type="dxa" w:w="100"/>
+            </w:tcMar>
+          </w:tcPr>
+          <w:p>
+            <w:r>
+              <w:rPr>
+                <w:rFonts w:ascii="Times New Roman" w:cs="Times New Roman" w:eastAsia="標楷體" w:hAnsi="Times New Roman"/>
+                <w:b w:val="false"/>
+                <w:bCs w:val="false"/>
+                <w:sz w:val="22"/>
+                <w:szCs w:val="22"/>
+              </w:rPr>
+              <w:t xml:space="preserve">APACHE II</w:t>
+            </w:r>
+          </w:p>
+        </w:tc>
+        <w:tc>
+          <w:tcPr>
+            <w:tcW w:type="dxa" w:w="3600"/>
+            <w:tcBorders>
+              <w:top w:val="single" w:color="999999" w:sz="4"/>
+              <w:left w:val="single" w:color="999999" w:sz="4"/>
+              <w:bottom w:val="single" w:color="999999" w:sz="4"/>
+              <w:right w:val="single" w:color="999999" w:sz="4"/>
+            </w:tcBorders>
+            <w:tcMar>
+              <w:top w:type="dxa" w:w="60"/>
+              <w:left w:type="dxa" w:w="100"/>
+              <w:bottom w:type="dxa" w:w="60"/>
+              <w:right w:type="dxa" w:w="100"/>
+            </w:tcMar>
+          </w:tcPr>
+          <w:p>
+            <w:r>
+              <w:rPr>
+                <w:rFonts w:ascii="Times New Roman" w:cs="Times New Roman" w:eastAsia="標楷體" w:hAnsi="Times New Roman"/>
+                <w:b w:val="false"/>
+                <w:bCs w:val="false"/>
+                <w:sz w:val="22"/>
+                <w:szCs w:val="22"/>
+              </w:rPr>
+              <w:t xml:space="preserve">病情嚴重度、預測死亡率（入住 24 小時）</w:t>
+            </w:r>
+          </w:p>
+        </w:tc>
+        <w:tc>
+          <w:tcPr>
+            <w:tcW w:type="dxa" w:w="4000"/>
+            <w:tcBorders>
+              <w:top w:val="single" w:color="999999" w:sz="4"/>
+              <w:left w:val="single" w:color="999999" w:sz="4"/>
+              <w:bottom w:val="single" w:color="999999" w:sz="4"/>
+              <w:right w:val="single" w:color="999999" w:sz="4"/>
+            </w:tcBorders>
+            <w:tcMar>
+              <w:top w:type="dxa" w:w="60"/>
+              <w:left w:type="dxa" w:w="100"/>
+              <w:bottom w:type="dxa" w:w="60"/>
+              <w:right w:type="dxa" w:w="100"/>
+            </w:tcMar>
+          </w:tcPr>
+          <w:p>
+            <w:r>
+              <w:rPr>
+                <w:rFonts w:ascii="Times New Roman" w:cs="Times New Roman" w:eastAsia="標楷體" w:hAnsi="Times New Roman"/>
+                <w:b w:val="false"/>
+                <w:bCs w:val="false"/>
+                <w:sz w:val="22"/>
+                <w:szCs w:val="22"/>
+              </w:rPr>
+              <w:t xml:space="preserve">完全不是工作量工具；病情重不等於護理時間多</w:t>
+            </w:r>
+          </w:p>
+        </w:tc>
+      </w:tr>
+      <w:tr>
+        <w:tc>
+          <w:tcPr>
+            <w:tcW w:type="dxa" w:w="2000"/>
+            <w:tcBorders>
+              <w:top w:val="single" w:color="999999" w:sz="4"/>
+              <w:left w:val="single" w:color="999999" w:sz="4"/>
+              <w:bottom w:val="single" w:color="999999" w:sz="4"/>
+              <w:right w:val="single" w:color="999999" w:sz="4"/>
+            </w:tcBorders>
+            <w:tcMar>
+              <w:top w:type="dxa" w:w="60"/>
+              <w:left w:type="dxa" w:w="100"/>
+              <w:bottom w:type="dxa" w:w="60"/>
+              <w:right w:type="dxa" w:w="100"/>
+            </w:tcMar>
+          </w:tcPr>
+          <w:p>
+            <w:r>
+              <w:rPr>
+                <w:rFonts w:ascii="Times New Roman" w:cs="Times New Roman" w:eastAsia="標楷體" w:hAnsi="Times New Roman"/>
+                <w:b w:val="false"/>
+                <w:bCs w:val="false"/>
+                <w:sz w:val="22"/>
+                <w:szCs w:val="22"/>
+              </w:rPr>
+              <w:t xml:space="preserve">TISS-28</w:t>
+            </w:r>
+          </w:p>
+        </w:tc>
+        <w:tc>
+          <w:tcPr>
+            <w:tcW w:type="dxa" w:w="3600"/>
+            <w:tcBorders>
+              <w:top w:val="single" w:color="999999" w:sz="4"/>
+              <w:left w:val="single" w:color="999999" w:sz="4"/>
+              <w:bottom w:val="single" w:color="999999" w:sz="4"/>
+              <w:right w:val="single" w:color="999999" w:sz="4"/>
+            </w:tcBorders>
+            <w:tcMar>
+              <w:top w:type="dxa" w:w="60"/>
+              <w:left w:type="dxa" w:w="100"/>
+              <w:bottom w:type="dxa" w:w="60"/>
+              <w:right w:type="dxa" w:w="100"/>
+            </w:tcMar>
+          </w:tcPr>
+          <w:p>
+            <w:r>
+              <w:rPr>
+                <w:rFonts w:ascii="Times New Roman" w:cs="Times New Roman" w:eastAsia="標楷體" w:hAnsi="Times New Roman"/>
+                <w:b w:val="false"/>
+                <w:bCs w:val="false"/>
+                <w:sz w:val="22"/>
+                <w:szCs w:val="22"/>
+              </w:rPr>
+              <w:t xml:space="preserve">對病人做了哪些治療（呼吸器、藥物、管路）</w:t>
+            </w:r>
+          </w:p>
+        </w:tc>
+        <w:tc>
+          <w:tcPr>
+            <w:tcW w:type="dxa" w:w="4000"/>
+            <w:tcBorders>
+              <w:top w:val="single" w:color="999999" w:sz="4"/>
+              <w:left w:val="single" w:color="999999" w:sz="4"/>
+              <w:bottom w:val="single" w:color="999999" w:sz="4"/>
+              <w:right w:val="single" w:color="999999" w:sz="4"/>
+            </w:tcBorders>
+            <w:tcMar>
+              <w:top w:type="dxa" w:w="60"/>
+              <w:left w:type="dxa" w:w="100"/>
+              <w:bottom w:type="dxa" w:w="60"/>
+              <w:right w:type="dxa" w:w="100"/>
+            </w:tcMar>
+          </w:tcPr>
+          <w:p>
+            <w:r>
+              <w:rPr>
+                <w:rFonts w:ascii="Times New Roman" w:cs="Times New Roman" w:eastAsia="標楷體" w:hAnsi="Times New Roman"/>
+                <w:b w:val="false"/>
+                <w:bCs w:val="false"/>
+                <w:sz w:val="22"/>
+                <w:szCs w:val="22"/>
+              </w:rPr>
+              <w:t xml:space="preserve">翻身與活動、清潔、持續床邊觀察、家屬支持、行政聯繫</w:t>
+            </w:r>
+          </w:p>
+        </w:tc>
+      </w:tr>
+      <w:tr>
+        <w:tc>
+          <w:tcPr>
+            <w:tcW w:type="dxa" w:w="2000"/>
+            <w:tcBorders>
+              <w:top w:val="single" w:color="999999" w:sz="4"/>
+              <w:left w:val="single" w:color="999999" w:sz="4"/>
+              <w:bottom w:val="single" w:color="999999" w:sz="4"/>
+              <w:right w:val="single" w:color="999999" w:sz="4"/>
+            </w:tcBorders>
+            <w:tcMar>
+              <w:top w:type="dxa" w:w="60"/>
+              <w:left w:type="dxa" w:w="100"/>
+              <w:bottom w:type="dxa" w:w="60"/>
+              <w:right w:type="dxa" w:w="100"/>
+            </w:tcMar>
+          </w:tcPr>
+          <w:p>
+            <w:r>
+              <w:rPr>
+                <w:rFonts w:ascii="Times New Roman" w:cs="Times New Roman" w:eastAsia="標楷體" w:hAnsi="Times New Roman"/>
+                <w:b w:val="false"/>
+                <w:bCs w:val="false"/>
+                <w:sz w:val="22"/>
+                <w:szCs w:val="22"/>
+              </w:rPr>
+              <w:t xml:space="preserve">NAS</w:t>
+            </w:r>
+          </w:p>
+        </w:tc>
+        <w:tc>
+          <w:tcPr>
+            <w:tcW w:type="dxa" w:w="3600"/>
+            <w:tcBorders>
+              <w:top w:val="single" w:color="999999" w:sz="4"/>
+              <w:left w:val="single" w:color="999999" w:sz="4"/>
+              <w:bottom w:val="single" w:color="999999" w:sz="4"/>
+              <w:right w:val="single" w:color="999999" w:sz="4"/>
+            </w:tcBorders>
+            <w:tcMar>
+              <w:top w:type="dxa" w:w="60"/>
+              <w:left w:type="dxa" w:w="100"/>
+              <w:bottom w:type="dxa" w:w="60"/>
+              <w:right w:type="dxa" w:w="100"/>
+            </w:tcMar>
+          </w:tcPr>
+          <w:p>
+            <w:r>
+              <w:rPr>
+                <w:rFonts w:ascii="Times New Roman" w:cs="Times New Roman" w:eastAsia="標楷體" w:hAnsi="Times New Roman"/>
+                <w:b w:val="false"/>
+                <w:bCs w:val="false"/>
+                <w:sz w:val="22"/>
+                <w:szCs w:val="22"/>
+              </w:rPr>
+              <w:t xml:space="preserve">護理活動花了一名護理師多少比例的時間</w:t>
+            </w:r>
+          </w:p>
+        </w:tc>
+        <w:tc>
+          <w:tcPr>
+            <w:tcW w:type="dxa" w:w="4000"/>
+            <w:tcBorders>
+              <w:top w:val="single" w:color="999999" w:sz="4"/>
+              <w:left w:val="single" w:color="999999" w:sz="4"/>
+              <w:bottom w:val="single" w:color="999999" w:sz="4"/>
+              <w:right w:val="single" w:color="999999" w:sz="4"/>
+            </w:tcBorders>
+            <w:tcMar>
+              <w:top w:type="dxa" w:w="60"/>
+              <w:left w:type="dxa" w:w="100"/>
+              <w:bottom w:type="dxa" w:w="60"/>
+              <w:right w:type="dxa" w:w="100"/>
+            </w:tcMar>
+          </w:tcPr>
+          <w:p>
+            <w:r>
+              <w:rPr>
+                <w:rFonts w:ascii="Times New Roman" w:cs="Times New Roman" w:eastAsia="標楷體" w:hAnsi="Times New Roman"/>
+                <w:b w:val="false"/>
+                <w:bCs w:val="false"/>
+                <w:sz w:val="22"/>
+                <w:szCs w:val="22"/>
+              </w:rPr>
+              <w:t xml:space="preserve">以 TISS-28 為基礎，補上上述項目</w:t>
+            </w:r>
+          </w:p>
+        </w:tc>
+      </w:tr>
+    </w:tbl>
+    <w:p>
+      <w:pPr>
+        <w:pStyle w:val="ListParagraph"/>
+        <w:numPr>
+          <w:ilvl w:val="0"/>
+          <w:numId w:val="2"/>
+        </w:numPr>
+        <w:spacing w:after="60" w:line="320"/>
+      </w:pPr>
+      <w:r>
+        <w:rPr>
+          <w:rFonts w:ascii="Times New Roman" w:cs="Times New Roman" w:eastAsia="標楷體" w:hAnsi="Times New Roman"/>
+        </w:rPr>
+        <w:t xml:space="preserve">國際研究：NAS 可解釋 81% 的護理時間，TISS-28 只有 43%；NAS 新增的活動約占平均護理時間的六成（Miranda et al., Crit Care Med 2003）。</w:t>
+      </w:r>
+    </w:p>
+    <w:p>
+      <w:pPr>
+        <w:pStyle w:val="ListParagraph"/>
+        <w:numPr>
+          <w:ilvl w:val="0"/>
+          <w:numId w:val="2"/>
+        </w:numPr>
+        <w:spacing w:after="60" w:line="320"/>
+      </w:pPr>
+      <w:r>
+        <w:rPr>
+          <w:rFonts w:ascii="Times New Roman" w:cs="Times New Roman" w:eastAsia="標楷體" w:hAnsi="Times New Roman"/>
+        </w:rPr>
+        <w:t xml:space="preserve">典型落差：未插管、譫妄躁動、需持續看守與多人翻身的病人，APACHE／TISS 偏低，實際最耗人力；病情很重但穩定鎮靜的病人則相反。</w:t>
+      </w:r>
+    </w:p>
+    <w:p>
+      <w:pPr>
+        <w:pStyle w:val="ListParagraph"/>
+        <w:numPr>
+          <w:ilvl w:val="0"/>
+          <w:numId w:val="2"/>
+        </w:numPr>
+        <w:spacing w:after="60" w:line="320"/>
+      </w:pPr>
+      <w:r>
+        <w:rPr>
+          <w:rFonts w:ascii="Times New Roman" w:cs="Times New Roman" w:eastAsia="標楷體" w:hAnsi="Times New Roman"/>
+        </w:rPr>
+        <w:t xml:space="preserve">轉換成本低：NAS 是由 TISS-28 擴充而來，同仁熟悉大部分項目；現有 TISS 資料可作為預填與對照。</w:t>
+      </w:r>
+    </w:p>
+    <w:p>
+      <w:pPr>
+        <w:pStyle w:val="ListParagraph"/>
+        <w:numPr>
+          <w:ilvl w:val="0"/>
+          <w:numId w:val="2"/>
+        </w:numPr>
+        <w:spacing w:after="60" w:line="320"/>
+      </w:pPr>
+      <w:r>
+        <w:rPr>
+          <w:rFonts w:ascii="Times New Roman" w:cs="Times New Roman" w:eastAsia="標楷體" w:hAnsi="Times New Roman"/>
+        </w:rPr>
+        <w:t xml:space="preserve">最小可行性評估做法：同一批病人 2–4 週同時評 TISS-28 與 NAS，並請護理師班末自評負荷，用本院資料證明哪一個比較貼近臨床負擔。</w:t>
+      </w:r>
+    </w:p>
+    <w:p>
+      <w:pPr>
+        <w:spacing w:after="100" w:before="200"/>
+      </w:pPr>
+      <w:r>
+        <w:rPr>
+          <w:rFonts w:ascii="Times New Roman" w:cs="Times New Roman" w:eastAsia="標楷體" w:hAnsi="Times New Roman"/>
+          <w:b/>
+          <w:bCs/>
+          <w:sz w:val="28"/>
+          <w:szCs w:val="28"/>
+        </w:rPr>
+        <w:t xml:space="preserve">七、說法上的提醒</w:t>
       </w:r>
     </w:p>
     <w:p>

</xml_diff>

<commit_message>
Pivot option C to an order- and record-based nursing workload dashboard
Co-Authored-By: Claude Opus 5.5 <noreply@anthropic.com>
Claude-Session: https://claude.ai/code/session_017upeArPjxTak4ieM8E5m6y
</commit_message>
<xml_diff>
--- a/nursing-workload-proposal/護理主管會議討論稿_v0.1.docx
+++ b/nursing-workload-proposal/護理主管會議討論稿_v0.1.docx
@@ -1154,7 +1154,7 @@
         <w:rPr>
           <w:rFonts w:ascii="Times New Roman" w:cs="Times New Roman" w:eastAsia="標楷體" w:hAnsi="Times New Roman"/>
         </w:rPr>
-        <w:t xml:space="preserve">是否同時提出「3 個月最小可行性評估」：在內科病房之間、外科病房之間、內外科加護之間，比較同樣合法的單位實際負荷差多少，作為之後配置與開床的依據（不需額外經費）。</w:t>
+        <w:t xml:space="preserve">是否同時提出「護理負荷儀表板」：串接現有醫囑、給藥執行與入出轉資料，按單位、班別呈現每位護理師的工作量；內科病房之間、外科病房之間、內外科加護之間互比。不做研究、不增加護理師填寫。</w:t>
       </w:r>
     </w:p>
     <w:p>
@@ -1626,7 +1626,7 @@
         <w:rPr>
           <w:rFonts w:ascii="Times New Roman" w:cs="Times New Roman" w:eastAsia="標楷體" w:hAnsi="Times New Roman"/>
         </w:rPr>
-        <w:t xml:space="preserve">最小可行性評估做法：同一批病人 2–4 週同時評 TISS-28 與 NAS，並請護理師班末自評負荷，用本院資料證明哪一個比較貼近臨床負擔。</w:t>
+        <w:t xml:space="preserve">近期做法：不另做研究，先用既有資料（TISS、醫囑、給藥執行、入出轉）呈現；NAS 列為日後需要時的選項。</w:t>
       </w:r>
     </w:p>
     <w:p>
@@ -1641,7 +1641,625 @@
           <w:sz w:val="28"/>
           <w:szCs w:val="28"/>
         </w:rPr>
-        <w:t xml:space="preserve">七、說法上的提醒</w:t>
+        <w:t xml:space="preserve">七、護理負荷儀表板構想（串接醫囑與護理紀錄，不增加填寫）</w:t>
+      </w:r>
+    </w:p>
+    <w:tbl>
+      <w:tblPr>
+        <w:tblW w:type="dxa" w:w="9600"/>
+        <w:tblBorders>
+          <w:top w:val="single" w:color="auto" w:sz="4"/>
+          <w:left w:val="single" w:color="auto" w:sz="4"/>
+          <w:bottom w:val="single" w:color="auto" w:sz="4"/>
+          <w:right w:val="single" w:color="auto" w:sz="4"/>
+          <w:insideH w:val="single" w:color="auto" w:sz="4"/>
+          <w:insideV w:val="single" w:color="auto" w:sz="4"/>
+        </w:tblBorders>
+      </w:tblPr>
+      <w:tblGrid>
+        <w:gridCol w:w="3000"/>
+        <w:gridCol w:w="3600"/>
+        <w:gridCol w:w="3000"/>
+      </w:tblGrid>
+      <w:tr>
+        <w:tc>
+          <w:tcPr>
+            <w:tcW w:type="dxa" w:w="3000"/>
+            <w:tcBorders>
+              <w:top w:val="single" w:color="999999" w:sz="4"/>
+              <w:left w:val="single" w:color="999999" w:sz="4"/>
+              <w:bottom w:val="single" w:color="999999" w:sz="4"/>
+              <w:right w:val="single" w:color="999999" w:sz="4"/>
+            </w:tcBorders>
+            <w:shd w:fill="D9E1F2" w:color="auto" w:val="clear"/>
+            <w:tcMar>
+              <w:top w:type="dxa" w:w="60"/>
+              <w:left w:type="dxa" w:w="100"/>
+              <w:bottom w:type="dxa" w:w="60"/>
+              <w:right w:type="dxa" w:w="100"/>
+            </w:tcMar>
+          </w:tcPr>
+          <w:p>
+            <w:r>
+              <w:rPr>
+                <w:rFonts w:ascii="Times New Roman" w:cs="Times New Roman" w:eastAsia="標楷體" w:hAnsi="Times New Roman"/>
+                <w:b/>
+                <w:bCs/>
+                <w:sz w:val="22"/>
+                <w:szCs w:val="22"/>
+              </w:rPr>
+              <w:t xml:space="preserve">資料來源</w:t>
+            </w:r>
+          </w:p>
+        </w:tc>
+        <w:tc>
+          <w:tcPr>
+            <w:tcW w:type="dxa" w:w="3600"/>
+            <w:tcBorders>
+              <w:top w:val="single" w:color="999999" w:sz="4"/>
+              <w:left w:val="single" w:color="999999" w:sz="4"/>
+              <w:bottom w:val="single" w:color="999999" w:sz="4"/>
+              <w:right w:val="single" w:color="999999" w:sz="4"/>
+            </w:tcBorders>
+            <w:shd w:fill="D9E1F2" w:color="auto" w:val="clear"/>
+            <w:tcMar>
+              <w:top w:type="dxa" w:w="60"/>
+              <w:left w:type="dxa" w:w="100"/>
+              <w:bottom w:type="dxa" w:w="60"/>
+              <w:right w:type="dxa" w:w="100"/>
+            </w:tcMar>
+          </w:tcPr>
+          <w:p>
+            <w:r>
+              <w:rPr>
+                <w:rFonts w:ascii="Times New Roman" w:cs="Times New Roman" w:eastAsia="標楷體" w:hAnsi="Times New Roman"/>
+                <w:b/>
+                <w:bCs/>
+                <w:sz w:val="22"/>
+                <w:szCs w:val="22"/>
+              </w:rPr>
+              <w:t xml:space="preserve">可呈現的指標（每單位、每班、每位護理師）</w:t>
+            </w:r>
+          </w:p>
+        </w:tc>
+        <w:tc>
+          <w:tcPr>
+            <w:tcW w:type="dxa" w:w="3000"/>
+            <w:tcBorders>
+              <w:top w:val="single" w:color="999999" w:sz="4"/>
+              <w:left w:val="single" w:color="999999" w:sz="4"/>
+              <w:bottom w:val="single" w:color="999999" w:sz="4"/>
+              <w:right w:val="single" w:color="999999" w:sz="4"/>
+            </w:tcBorders>
+            <w:shd w:fill="D9E1F2" w:color="auto" w:val="clear"/>
+            <w:tcMar>
+              <w:top w:type="dxa" w:w="60"/>
+              <w:left w:type="dxa" w:w="100"/>
+              <w:bottom w:type="dxa" w:w="60"/>
+              <w:right w:type="dxa" w:w="100"/>
+            </w:tcMar>
+          </w:tcPr>
+          <w:p>
+            <w:r>
+              <w:rPr>
+                <w:rFonts w:ascii="Times New Roman" w:cs="Times New Roman" w:eastAsia="標楷體" w:hAnsi="Times New Roman"/>
+                <w:b/>
+                <w:bCs/>
+                <w:sz w:val="22"/>
+                <w:szCs w:val="22"/>
+              </w:rPr>
+              <w:t xml:space="preserve">注意事項</w:t>
+            </w:r>
+          </w:p>
+        </w:tc>
+      </w:tr>
+      <w:tr>
+        <w:tc>
+          <w:tcPr>
+            <w:tcW w:type="dxa" w:w="3000"/>
+            <w:tcBorders>
+              <w:top w:val="single" w:color="999999" w:sz="4"/>
+              <w:left w:val="single" w:color="999999" w:sz="4"/>
+              <w:bottom w:val="single" w:color="999999" w:sz="4"/>
+              <w:right w:val="single" w:color="999999" w:sz="4"/>
+            </w:tcBorders>
+            <w:tcMar>
+              <w:top w:type="dxa" w:w="60"/>
+              <w:left w:type="dxa" w:w="100"/>
+              <w:bottom w:type="dxa" w:w="60"/>
+              <w:right w:type="dxa" w:w="100"/>
+            </w:tcMar>
+          </w:tcPr>
+          <w:p>
+            <w:r>
+              <w:rPr>
+                <w:rFonts w:ascii="Times New Roman" w:cs="Times New Roman" w:eastAsia="標楷體" w:hAnsi="Times New Roman"/>
+                <w:b w:val="false"/>
+                <w:bCs w:val="false"/>
+                <w:sz w:val="22"/>
+                <w:szCs w:val="22"/>
+              </w:rPr>
+              <w:t xml:space="preserve">入出轉（ADT）</w:t>
+            </w:r>
+          </w:p>
+        </w:tc>
+        <w:tc>
+          <w:tcPr>
+            <w:tcW w:type="dxa" w:w="3600"/>
+            <w:tcBorders>
+              <w:top w:val="single" w:color="999999" w:sz="4"/>
+              <w:left w:val="single" w:color="999999" w:sz="4"/>
+              <w:bottom w:val="single" w:color="999999" w:sz="4"/>
+              <w:right w:val="single" w:color="999999" w:sz="4"/>
+            </w:tcBorders>
+            <w:tcMar>
+              <w:top w:type="dxa" w:w="60"/>
+              <w:left w:type="dxa" w:w="100"/>
+              <w:bottom w:type="dxa" w:w="60"/>
+              <w:right w:type="dxa" w:w="100"/>
+            </w:tcMar>
+          </w:tcPr>
+          <w:p>
+            <w:r>
+              <w:rPr>
+                <w:rFonts w:ascii="Times New Roman" w:cs="Times New Roman" w:eastAsia="標楷體" w:hAnsi="Times New Roman"/>
+                <w:b w:val="false"/>
+                <w:bCs w:val="false"/>
+                <w:sz w:val="22"/>
+                <w:szCs w:val="22"/>
+              </w:rPr>
+              <w:t xml:space="preserve">新入院、出院、轉入轉出、術後返室人次</w:t>
+            </w:r>
+          </w:p>
+        </w:tc>
+        <w:tc>
+          <w:tcPr>
+            <w:tcW w:type="dxa" w:w="3000"/>
+            <w:tcBorders>
+              <w:top w:val="single" w:color="999999" w:sz="4"/>
+              <w:left w:val="single" w:color="999999" w:sz="4"/>
+              <w:bottom w:val="single" w:color="999999" w:sz="4"/>
+              <w:right w:val="single" w:color="999999" w:sz="4"/>
+            </w:tcBorders>
+            <w:tcMar>
+              <w:top w:type="dxa" w:w="60"/>
+              <w:left w:type="dxa" w:w="100"/>
+              <w:bottom w:type="dxa" w:w="60"/>
+              <w:right w:type="dxa" w:w="100"/>
+            </w:tcMar>
+          </w:tcPr>
+          <w:p>
+            <w:r>
+              <w:rPr>
+                <w:rFonts w:ascii="Times New Roman" w:cs="Times New Roman" w:eastAsia="標楷體" w:hAnsi="Times New Roman"/>
+                <w:b w:val="false"/>
+                <w:bCs w:val="false"/>
+                <w:sz w:val="22"/>
+                <w:szCs w:val="22"/>
+              </w:rPr>
+              <w:t xml:space="preserve">周轉量是護病比看不到的負荷</w:t>
+            </w:r>
+          </w:p>
+        </w:tc>
+      </w:tr>
+      <w:tr>
+        <w:tc>
+          <w:tcPr>
+            <w:tcW w:type="dxa" w:w="3000"/>
+            <w:tcBorders>
+              <w:top w:val="single" w:color="999999" w:sz="4"/>
+              <w:left w:val="single" w:color="999999" w:sz="4"/>
+              <w:bottom w:val="single" w:color="999999" w:sz="4"/>
+              <w:right w:val="single" w:color="999999" w:sz="4"/>
+            </w:tcBorders>
+            <w:tcMar>
+              <w:top w:type="dxa" w:w="60"/>
+              <w:left w:type="dxa" w:w="100"/>
+              <w:bottom w:type="dxa" w:w="60"/>
+              <w:right w:type="dxa" w:w="100"/>
+            </w:tcMar>
+          </w:tcPr>
+          <w:p>
+            <w:r>
+              <w:rPr>
+                <w:rFonts w:ascii="Times New Roman" w:cs="Times New Roman" w:eastAsia="標楷體" w:hAnsi="Times New Roman"/>
+                <w:b w:val="false"/>
+                <w:bCs w:val="false"/>
+                <w:sz w:val="22"/>
+                <w:szCs w:val="22"/>
+              </w:rPr>
+              <w:t xml:space="preserve">給藥執行紀錄（eMAR）</w:t>
+            </w:r>
+          </w:p>
+        </w:tc>
+        <w:tc>
+          <w:tcPr>
+            <w:tcW w:type="dxa" w:w="3600"/>
+            <w:tcBorders>
+              <w:top w:val="single" w:color="999999" w:sz="4"/>
+              <w:left w:val="single" w:color="999999" w:sz="4"/>
+              <w:bottom w:val="single" w:color="999999" w:sz="4"/>
+              <w:right w:val="single" w:color="999999" w:sz="4"/>
+            </w:tcBorders>
+            <w:tcMar>
+              <w:top w:type="dxa" w:w="60"/>
+              <w:left w:type="dxa" w:w="100"/>
+              <w:bottom w:type="dxa" w:w="60"/>
+              <w:right w:type="dxa" w:w="100"/>
+            </w:tcMar>
+          </w:tcPr>
+          <w:p>
+            <w:r>
+              <w:rPr>
+                <w:rFonts w:ascii="Times New Roman" w:cs="Times New Roman" w:eastAsia="標楷體" w:hAnsi="Times New Roman"/>
+                <w:b w:val="false"/>
+                <w:bCs w:val="false"/>
+                <w:sz w:val="22"/>
+                <w:szCs w:val="22"/>
+              </w:rPr>
+              <w:t xml:space="preserve">實際給藥次數，其中靜脈、高警訊藥物次數</w:t>
+            </w:r>
+          </w:p>
+        </w:tc>
+        <w:tc>
+          <w:tcPr>
+            <w:tcW w:type="dxa" w:w="3000"/>
+            <w:tcBorders>
+              <w:top w:val="single" w:color="999999" w:sz="4"/>
+              <w:left w:val="single" w:color="999999" w:sz="4"/>
+              <w:bottom w:val="single" w:color="999999" w:sz="4"/>
+              <w:right w:val="single" w:color="999999" w:sz="4"/>
+            </w:tcBorders>
+            <w:tcMar>
+              <w:top w:type="dxa" w:w="60"/>
+              <w:left w:type="dxa" w:w="100"/>
+              <w:bottom w:type="dxa" w:w="60"/>
+              <w:right w:type="dxa" w:w="100"/>
+            </w:tcMar>
+          </w:tcPr>
+          <w:p>
+            <w:r>
+              <w:rPr>
+                <w:rFonts w:ascii="Times New Roman" w:cs="Times New Roman" w:eastAsia="標楷體" w:hAnsi="Times New Roman"/>
+                <w:b w:val="false"/>
+                <w:bCs w:val="false"/>
+                <w:sz w:val="22"/>
+                <w:szCs w:val="22"/>
+              </w:rPr>
+              <w:t xml:space="preserve">用「已執行」紀錄，不用醫囑筆數</w:t>
+            </w:r>
+          </w:p>
+        </w:tc>
+      </w:tr>
+      <w:tr>
+        <w:tc>
+          <w:tcPr>
+            <w:tcW w:type="dxa" w:w="3000"/>
+            <w:tcBorders>
+              <w:top w:val="single" w:color="999999" w:sz="4"/>
+              <w:left w:val="single" w:color="999999" w:sz="4"/>
+              <w:bottom w:val="single" w:color="999999" w:sz="4"/>
+              <w:right w:val="single" w:color="999999" w:sz="4"/>
+            </w:tcBorders>
+            <w:tcMar>
+              <w:top w:type="dxa" w:w="60"/>
+              <w:left w:type="dxa" w:w="100"/>
+              <w:bottom w:type="dxa" w:w="60"/>
+              <w:right w:type="dxa" w:w="100"/>
+            </w:tcMar>
+          </w:tcPr>
+          <w:p>
+            <w:r>
+              <w:rPr>
+                <w:rFonts w:ascii="Times New Roman" w:cs="Times New Roman" w:eastAsia="標楷體" w:hAnsi="Times New Roman"/>
+                <w:b w:val="false"/>
+                <w:bCs w:val="false"/>
+                <w:sz w:val="22"/>
+                <w:szCs w:val="22"/>
+              </w:rPr>
+              <w:t xml:space="preserve">醫囑（CPOE）</w:t>
+            </w:r>
+          </w:p>
+        </w:tc>
+        <w:tc>
+          <w:tcPr>
+            <w:tcW w:type="dxa" w:w="3600"/>
+            <w:tcBorders>
+              <w:top w:val="single" w:color="999999" w:sz="4"/>
+              <w:left w:val="single" w:color="999999" w:sz="4"/>
+              <w:bottom w:val="single" w:color="999999" w:sz="4"/>
+              <w:right w:val="single" w:color="999999" w:sz="4"/>
+            </w:tcBorders>
+            <w:tcMar>
+              <w:top w:type="dxa" w:w="60"/>
+              <w:left w:type="dxa" w:w="100"/>
+              <w:bottom w:type="dxa" w:w="60"/>
+              <w:right w:type="dxa" w:w="100"/>
+            </w:tcMar>
+          </w:tcPr>
+          <w:p>
+            <w:r>
+              <w:rPr>
+                <w:rFonts w:ascii="Times New Roman" w:cs="Times New Roman" w:eastAsia="標楷體" w:hAnsi="Times New Roman"/>
+                <w:b w:val="false"/>
+                <w:bCs w:val="false"/>
+                <w:sz w:val="22"/>
+                <w:szCs w:val="22"/>
+              </w:rPr>
+              <w:t xml:space="preserve">抽血檢驗、輸血、檢查（含需護送外出）次數</w:t>
+            </w:r>
+          </w:p>
+        </w:tc>
+        <w:tc>
+          <w:tcPr>
+            <w:tcW w:type="dxa" w:w="3000"/>
+            <w:tcBorders>
+              <w:top w:val="single" w:color="999999" w:sz="4"/>
+              <w:left w:val="single" w:color="999999" w:sz="4"/>
+              <w:bottom w:val="single" w:color="999999" w:sz="4"/>
+              <w:right w:val="single" w:color="999999" w:sz="4"/>
+            </w:tcBorders>
+            <w:tcMar>
+              <w:top w:type="dxa" w:w="60"/>
+              <w:left w:type="dxa" w:w="100"/>
+              <w:bottom w:type="dxa" w:w="60"/>
+              <w:right w:type="dxa" w:w="100"/>
+            </w:tcMar>
+          </w:tcPr>
+          <w:p>
+            <w:r>
+              <w:rPr>
+                <w:rFonts w:ascii="Times New Roman" w:cs="Times New Roman" w:eastAsia="標楷體" w:hAnsi="Times New Roman"/>
+                <w:b w:val="false"/>
+                <w:bCs w:val="false"/>
+                <w:sz w:val="22"/>
+                <w:szCs w:val="22"/>
+              </w:rPr>
+              <w:t xml:space="preserve">醫師開立習慣不同，只做同科互比</w:t>
+            </w:r>
+          </w:p>
+        </w:tc>
+      </w:tr>
+      <w:tr>
+        <w:tc>
+          <w:tcPr>
+            <w:tcW w:type="dxa" w:w="3000"/>
+            <w:tcBorders>
+              <w:top w:val="single" w:color="999999" w:sz="4"/>
+              <w:left w:val="single" w:color="999999" w:sz="4"/>
+              <w:bottom w:val="single" w:color="999999" w:sz="4"/>
+              <w:right w:val="single" w:color="999999" w:sz="4"/>
+            </w:tcBorders>
+            <w:tcMar>
+              <w:top w:type="dxa" w:w="60"/>
+              <w:left w:type="dxa" w:w="100"/>
+              <w:bottom w:type="dxa" w:w="60"/>
+              <w:right w:type="dxa" w:w="100"/>
+            </w:tcMar>
+          </w:tcPr>
+          <w:p>
+            <w:r>
+              <w:rPr>
+                <w:rFonts w:ascii="Times New Roman" w:cs="Times New Roman" w:eastAsia="標楷體" w:hAnsi="Times New Roman"/>
+                <w:b w:val="false"/>
+                <w:bCs w:val="false"/>
+                <w:sz w:val="22"/>
+                <w:szCs w:val="22"/>
+              </w:rPr>
+              <w:t xml:space="preserve">護理紀錄（NIS）</w:t>
+            </w:r>
+          </w:p>
+        </w:tc>
+        <w:tc>
+          <w:tcPr>
+            <w:tcW w:type="dxa" w:w="3600"/>
+            <w:tcBorders>
+              <w:top w:val="single" w:color="999999" w:sz="4"/>
+              <w:left w:val="single" w:color="999999" w:sz="4"/>
+              <w:bottom w:val="single" w:color="999999" w:sz="4"/>
+              <w:right w:val="single" w:color="999999" w:sz="4"/>
+            </w:tcBorders>
+            <w:tcMar>
+              <w:top w:type="dxa" w:w="60"/>
+              <w:left w:type="dxa" w:w="100"/>
+              <w:bottom w:type="dxa" w:w="60"/>
+              <w:right w:type="dxa" w:w="100"/>
+            </w:tcMar>
+          </w:tcPr>
+          <w:p>
+            <w:r>
+              <w:rPr>
+                <w:rFonts w:ascii="Times New Roman" w:cs="Times New Roman" w:eastAsia="標楷體" w:hAnsi="Times New Roman"/>
+                <w:b w:val="false"/>
+                <w:bCs w:val="false"/>
+                <w:sz w:val="22"/>
+                <w:szCs w:val="22"/>
+              </w:rPr>
+              <w:t xml:space="preserve">約束、隔離、高跌倒風險、日常活動依賴、翻身紀錄的病人數</w:t>
+            </w:r>
+          </w:p>
+        </w:tc>
+        <w:tc>
+          <w:tcPr>
+            <w:tcW w:type="dxa" w:w="3000"/>
+            <w:tcBorders>
+              <w:top w:val="single" w:color="999999" w:sz="4"/>
+              <w:left w:val="single" w:color="999999" w:sz="4"/>
+              <w:bottom w:val="single" w:color="999999" w:sz="4"/>
+              <w:right w:val="single" w:color="999999" w:sz="4"/>
+            </w:tcBorders>
+            <w:tcMar>
+              <w:top w:type="dxa" w:w="60"/>
+              <w:left w:type="dxa" w:w="100"/>
+              <w:bottom w:type="dxa" w:w="60"/>
+              <w:right w:type="dxa" w:w="100"/>
+            </w:tcMar>
+          </w:tcPr>
+          <w:p>
+            <w:r>
+              <w:rPr>
+                <w:rFonts w:ascii="Times New Roman" w:cs="Times New Roman" w:eastAsia="標楷體" w:hAnsi="Times New Roman"/>
+                <w:b w:val="false"/>
+                <w:bCs w:val="false"/>
+                <w:sz w:val="22"/>
+                <w:szCs w:val="22"/>
+              </w:rPr>
+              <w:t xml:space="preserve">補上醫囑看不到的照顧工作</w:t>
+            </w:r>
+          </w:p>
+        </w:tc>
+      </w:tr>
+      <w:tr>
+        <w:tc>
+          <w:tcPr>
+            <w:tcW w:type="dxa" w:w="3000"/>
+            <w:tcBorders>
+              <w:top w:val="single" w:color="999999" w:sz="4"/>
+              <w:left w:val="single" w:color="999999" w:sz="4"/>
+              <w:bottom w:val="single" w:color="999999" w:sz="4"/>
+              <w:right w:val="single" w:color="999999" w:sz="4"/>
+            </w:tcBorders>
+            <w:tcMar>
+              <w:top w:type="dxa" w:w="60"/>
+              <w:left w:type="dxa" w:w="100"/>
+              <w:bottom w:type="dxa" w:w="60"/>
+              <w:right w:type="dxa" w:w="100"/>
+            </w:tcMar>
+          </w:tcPr>
+          <w:p>
+            <w:r>
+              <w:rPr>
+                <w:rFonts w:ascii="Times New Roman" w:cs="Times New Roman" w:eastAsia="標楷體" w:hAnsi="Times New Roman"/>
+                <w:b w:val="false"/>
+                <w:bCs w:val="false"/>
+                <w:sz w:val="22"/>
+                <w:szCs w:val="22"/>
+              </w:rPr>
+              <w:t xml:space="preserve">加護病房既有資料</w:t>
+            </w:r>
+          </w:p>
+        </w:tc>
+        <w:tc>
+          <w:tcPr>
+            <w:tcW w:type="dxa" w:w="3600"/>
+            <w:tcBorders>
+              <w:top w:val="single" w:color="999999" w:sz="4"/>
+              <w:left w:val="single" w:color="999999" w:sz="4"/>
+              <w:bottom w:val="single" w:color="999999" w:sz="4"/>
+              <w:right w:val="single" w:color="999999" w:sz="4"/>
+            </w:tcBorders>
+            <w:tcMar>
+              <w:top w:type="dxa" w:w="60"/>
+              <w:left w:type="dxa" w:w="100"/>
+              <w:bottom w:type="dxa" w:w="60"/>
+              <w:right w:type="dxa" w:w="100"/>
+            </w:tcMar>
+          </w:tcPr>
+          <w:p>
+            <w:r>
+              <w:rPr>
+                <w:rFonts w:ascii="Times New Roman" w:cs="Times New Roman" w:eastAsia="標楷體" w:hAnsi="Times New Roman"/>
+                <w:b w:val="false"/>
+                <w:bCs w:val="false"/>
+                <w:sz w:val="22"/>
+                <w:szCs w:val="22"/>
+              </w:rPr>
+              <w:t xml:space="preserve">TISS 分數、呼吸器、CRRT、ECMO 等使用人數</w:t>
+            </w:r>
+          </w:p>
+        </w:tc>
+        <w:tc>
+          <w:tcPr>
+            <w:tcW w:type="dxa" w:w="3000"/>
+            <w:tcBorders>
+              <w:top w:val="single" w:color="999999" w:sz="4"/>
+              <w:left w:val="single" w:color="999999" w:sz="4"/>
+              <w:bottom w:val="single" w:color="999999" w:sz="4"/>
+              <w:right w:val="single" w:color="999999" w:sz="4"/>
+            </w:tcBorders>
+            <w:tcMar>
+              <w:top w:type="dxa" w:w="60"/>
+              <w:left w:type="dxa" w:w="100"/>
+              <w:bottom w:type="dxa" w:w="60"/>
+              <w:right w:type="dxa" w:w="100"/>
+            </w:tcMar>
+          </w:tcPr>
+          <w:p>
+            <w:r>
+              <w:rPr>
+                <w:rFonts w:ascii="Times New Roman" w:cs="Times New Roman" w:eastAsia="標楷體" w:hAnsi="Times New Roman"/>
+                <w:b w:val="false"/>
+                <w:bCs w:val="false"/>
+                <w:sz w:val="22"/>
+                <w:szCs w:val="22"/>
+              </w:rPr>
+              <w:t xml:space="preserve">TISS 只反映治療，需搭配上列資料</w:t>
+            </w:r>
+          </w:p>
+        </w:tc>
+      </w:tr>
+    </w:tbl>
+    <w:p>
+      <w:pPr>
+        <w:pStyle w:val="ListParagraph"/>
+        <w:numPr>
+          <w:ilvl w:val="0"/>
+          <w:numId w:val="2"/>
+        </w:numPr>
+        <w:spacing w:after="60" w:line="320"/>
+      </w:pPr>
+      <w:r>
+        <w:rPr>
+          <w:rFonts w:ascii="Times New Roman" w:cs="Times New Roman" w:eastAsia="標楷體" w:hAnsi="Times New Roman"/>
+        </w:rPr>
+        <w:t xml:space="preserve">醫囑資料的盲點與 TISS 相同：只看得到「治療」，看不到翻身、清潔、看守躁動病人、家屬支持。因此一定要搭配給藥執行與護理紀錄。</w:t>
+      </w:r>
+    </w:p>
+    <w:p>
+      <w:pPr>
+        <w:pStyle w:val="ListParagraph"/>
+        <w:numPr>
+          <w:ilvl w:val="0"/>
+          <w:numId w:val="2"/>
+        </w:numPr>
+        <w:spacing w:after="60" w:line="320"/>
+      </w:pPr>
+      <w:r>
+        <w:rPr>
+          <w:rFonts w:ascii="Times New Roman" w:cs="Times New Roman" w:eastAsia="標楷體" w:hAnsi="Times New Roman"/>
+        </w:rPr>
+        <w:t xml:space="preserve">第一版只呈現「次數」，不換算成分鐘或員額，避免被質疑權重依據；用來看單位之間、班別之間的落差。</w:t>
+      </w:r>
+    </w:p>
+    <w:p>
+      <w:pPr>
+        <w:pStyle w:val="ListParagraph"/>
+        <w:numPr>
+          <w:ilvl w:val="0"/>
+          <w:numId w:val="2"/>
+        </w:numPr>
+        <w:spacing w:after="60" w:line="320"/>
+      </w:pPr>
+      <w:r>
+        <w:rPr>
+          <w:rFonts w:ascii="Times New Roman" w:cs="Times New Roman" w:eastAsia="標楷體" w:hAnsi="Times New Roman"/>
+        </w:rPr>
+        <w:t xml:space="preserve">需要資訊室協助撈取資料；以單位、班別彙總呈現，不含病人個資。</w:t>
+      </w:r>
+    </w:p>
+    <w:p>
+      <w:pPr>
+        <w:spacing w:after="100" w:before="200"/>
+      </w:pPr>
+      <w:r>
+        <w:rPr>
+          <w:rFonts w:ascii="Times New Roman" w:cs="Times New Roman" w:eastAsia="標楷體" w:hAnsi="Times New Roman"/>
+          <w:b/>
+          <w:bCs/>
+          <w:sz w:val="28"/>
+          <w:szCs w:val="28"/>
+        </w:rPr>
+        <w:t xml:space="preserve">八、說法上的提醒</w:t>
       </w:r>
     </w:p>
     <w:p>

</xml_diff>

<commit_message>
Add general ward content to meeting brief and director summary
Co-Authored-By: Claude Opus 5.5 <noreply@anthropic.com>
Claude-Session: https://claude.ai/code/session_017upeArPjxTak4ieM8E5m6y
</commit_message>
<xml_diff>
--- a/nursing-workload-proposal/護理主管會議討論稿_v0.1.docx
+++ b/nursing-workload-proposal/護理主管會議討論稿_v0.1.docx
@@ -1641,7 +1641,463 @@
           <w:sz w:val="28"/>
           <w:szCs w:val="28"/>
         </w:rPr>
-        <w:t xml:space="preserve">七、護理負荷儀表板構想（串接醫囑與護理紀錄，不增加填寫）</w:t>
+        <w:t xml:space="preserve">七、內外科病房：三班護病比看不到的負荷</w:t>
+      </w:r>
+    </w:p>
+    <w:tbl>
+      <w:tblPr>
+        <w:tblW w:type="dxa" w:w="9600"/>
+        <w:tblBorders>
+          <w:top w:val="single" w:color="auto" w:sz="4"/>
+          <w:left w:val="single" w:color="auto" w:sz="4"/>
+          <w:bottom w:val="single" w:color="auto" w:sz="4"/>
+          <w:right w:val="single" w:color="auto" w:sz="4"/>
+          <w:insideH w:val="single" w:color="auto" w:sz="4"/>
+          <w:insideV w:val="single" w:color="auto" w:sz="4"/>
+        </w:tblBorders>
+      </w:tblPr>
+      <w:tblGrid>
+        <w:gridCol w:w="2600"/>
+        <w:gridCol w:w="3600"/>
+        <w:gridCol w:w="3400"/>
+      </w:tblGrid>
+      <w:tr>
+        <w:tc>
+          <w:tcPr>
+            <w:tcW w:type="dxa" w:w="2600"/>
+            <w:tcBorders>
+              <w:top w:val="single" w:color="999999" w:sz="4"/>
+              <w:left w:val="single" w:color="999999" w:sz="4"/>
+              <w:bottom w:val="single" w:color="999999" w:sz="4"/>
+              <w:right w:val="single" w:color="999999" w:sz="4"/>
+            </w:tcBorders>
+            <w:shd w:fill="D9E1F2" w:color="auto" w:val="clear"/>
+            <w:tcMar>
+              <w:top w:type="dxa" w:w="60"/>
+              <w:left w:type="dxa" w:w="100"/>
+              <w:bottom w:type="dxa" w:w="60"/>
+              <w:right w:type="dxa" w:w="100"/>
+            </w:tcMar>
+          </w:tcPr>
+          <w:p>
+            <w:r>
+              <w:rPr>
+                <w:rFonts w:ascii="Times New Roman" w:cs="Times New Roman" w:eastAsia="標楷體" w:hAnsi="Times New Roman"/>
+                <w:b/>
+                <w:bCs/>
+                <w:sz w:val="22"/>
+                <w:szCs w:val="22"/>
+              </w:rPr>
+              <w:t xml:space="preserve">看不到的負荷</w:t>
+            </w:r>
+          </w:p>
+        </w:tc>
+        <w:tc>
+          <w:tcPr>
+            <w:tcW w:type="dxa" w:w="3600"/>
+            <w:tcBorders>
+              <w:top w:val="single" w:color="999999" w:sz="4"/>
+              <w:left w:val="single" w:color="999999" w:sz="4"/>
+              <w:bottom w:val="single" w:color="999999" w:sz="4"/>
+              <w:right w:val="single" w:color="999999" w:sz="4"/>
+            </w:tcBorders>
+            <w:shd w:fill="D9E1F2" w:color="auto" w:val="clear"/>
+            <w:tcMar>
+              <w:top w:type="dxa" w:w="60"/>
+              <w:left w:type="dxa" w:w="100"/>
+              <w:bottom w:type="dxa" w:w="60"/>
+              <w:right w:type="dxa" w:w="100"/>
+            </w:tcMar>
+          </w:tcPr>
+          <w:p>
+            <w:r>
+              <w:rPr>
+                <w:rFonts w:ascii="Times New Roman" w:cs="Times New Roman" w:eastAsia="標楷體" w:hAnsi="Times New Roman"/>
+                <w:b/>
+                <w:bCs/>
+                <w:sz w:val="22"/>
+                <w:szCs w:val="22"/>
+              </w:rPr>
+              <w:t xml:space="preserve">說明</w:t>
+            </w:r>
+          </w:p>
+        </w:tc>
+        <w:tc>
+          <w:tcPr>
+            <w:tcW w:type="dxa" w:w="3400"/>
+            <w:tcBorders>
+              <w:top w:val="single" w:color="999999" w:sz="4"/>
+              <w:left w:val="single" w:color="999999" w:sz="4"/>
+              <w:bottom w:val="single" w:color="999999" w:sz="4"/>
+              <w:right w:val="single" w:color="999999" w:sz="4"/>
+            </w:tcBorders>
+            <w:shd w:fill="D9E1F2" w:color="auto" w:val="clear"/>
+            <w:tcMar>
+              <w:top w:type="dxa" w:w="60"/>
+              <w:left w:type="dxa" w:w="100"/>
+              <w:bottom w:type="dxa" w:w="60"/>
+              <w:right w:type="dxa" w:w="100"/>
+            </w:tcMar>
+          </w:tcPr>
+          <w:p>
+            <w:r>
+              <w:rPr>
+                <w:rFonts w:ascii="Times New Roman" w:cs="Times New Roman" w:eastAsia="標楷體" w:hAnsi="Times New Roman"/>
+                <w:b/>
+                <w:bCs/>
+                <w:sz w:val="22"/>
+                <w:szCs w:val="22"/>
+              </w:rPr>
+              <w:t xml:space="preserve">文獻</w:t>
+            </w:r>
+          </w:p>
+        </w:tc>
+      </w:tr>
+      <w:tr>
+        <w:tc>
+          <w:tcPr>
+            <w:tcW w:type="dxa" w:w="2600"/>
+            <w:tcBorders>
+              <w:top w:val="single" w:color="999999" w:sz="4"/>
+              <w:left w:val="single" w:color="999999" w:sz="4"/>
+              <w:bottom w:val="single" w:color="999999" w:sz="4"/>
+              <w:right w:val="single" w:color="999999" w:sz="4"/>
+            </w:tcBorders>
+            <w:tcMar>
+              <w:top w:type="dxa" w:w="60"/>
+              <w:left w:type="dxa" w:w="100"/>
+              <w:bottom w:type="dxa" w:w="60"/>
+              <w:right w:type="dxa" w:w="100"/>
+            </w:tcMar>
+          </w:tcPr>
+          <w:p>
+            <w:r>
+              <w:rPr>
+                <w:rFonts w:ascii="Times New Roman" w:cs="Times New Roman" w:eastAsia="標楷體" w:hAnsi="Times New Roman"/>
+                <w:b w:val="false"/>
+                <w:bCs w:val="false"/>
+                <w:sz w:val="22"/>
+                <w:szCs w:val="22"/>
+              </w:rPr>
+              <w:t xml:space="preserve">入出院周轉</w:t>
+            </w:r>
+          </w:p>
+        </w:tc>
+        <w:tc>
+          <w:tcPr>
+            <w:tcW w:type="dxa" w:w="3600"/>
+            <w:tcBorders>
+              <w:top w:val="single" w:color="999999" w:sz="4"/>
+              <w:left w:val="single" w:color="999999" w:sz="4"/>
+              <w:bottom w:val="single" w:color="999999" w:sz="4"/>
+              <w:right w:val="single" w:color="999999" w:sz="4"/>
+            </w:tcBorders>
+            <w:tcMar>
+              <w:top w:type="dxa" w:w="60"/>
+              <w:left w:type="dxa" w:w="100"/>
+              <w:bottom w:type="dxa" w:w="60"/>
+              <w:right w:type="dxa" w:w="100"/>
+            </w:tcMar>
+          </w:tcPr>
+          <w:p>
+            <w:r>
+              <w:rPr>
+                <w:rFonts w:ascii="Times New Roman" w:cs="Times New Roman" w:eastAsia="標楷體" w:hAnsi="Times New Roman"/>
+                <w:b w:val="false"/>
+                <w:bCs w:val="false"/>
+                <w:sz w:val="22"/>
+                <w:szCs w:val="22"/>
+              </w:rPr>
+              <w:t xml:space="preserve">同一床白天出院一位、下午入院一位，護病比只算 1 人，實際是兩份工作（出院衛教、入院評估、新醫囑）</w:t>
+            </w:r>
+          </w:p>
+        </w:tc>
+        <w:tc>
+          <w:tcPr>
+            <w:tcW w:type="dxa" w:w="3400"/>
+            <w:tcBorders>
+              <w:top w:val="single" w:color="999999" w:sz="4"/>
+              <w:left w:val="single" w:color="999999" w:sz="4"/>
+              <w:bottom w:val="single" w:color="999999" w:sz="4"/>
+              <w:right w:val="single" w:color="999999" w:sz="4"/>
+            </w:tcBorders>
+            <w:tcMar>
+              <w:top w:type="dxa" w:w="60"/>
+              <w:left w:type="dxa" w:w="100"/>
+              <w:bottom w:type="dxa" w:w="60"/>
+              <w:right w:type="dxa" w:w="100"/>
+            </w:tcMar>
+          </w:tcPr>
+          <w:p>
+            <w:r>
+              <w:rPr>
+                <w:rFonts w:ascii="Times New Roman" w:cs="Times New Roman" w:eastAsia="標楷體" w:hAnsi="Times New Roman"/>
+                <w:b w:val="false"/>
+                <w:bCs w:val="false"/>
+                <w:sz w:val="22"/>
+                <w:szCs w:val="22"/>
+              </w:rPr>
+              <w:t xml:space="preserve">高周轉的班，病人死亡風險上升（Needleman, NEJM 2011，HR 1.04）</w:t>
+            </w:r>
+          </w:p>
+        </w:tc>
+      </w:tr>
+      <w:tr>
+        <w:tc>
+          <w:tcPr>
+            <w:tcW w:type="dxa" w:w="2600"/>
+            <w:tcBorders>
+              <w:top w:val="single" w:color="999999" w:sz="4"/>
+              <w:left w:val="single" w:color="999999" w:sz="4"/>
+              <w:bottom w:val="single" w:color="999999" w:sz="4"/>
+              <w:right w:val="single" w:color="999999" w:sz="4"/>
+            </w:tcBorders>
+            <w:tcMar>
+              <w:top w:type="dxa" w:w="60"/>
+              <w:left w:type="dxa" w:w="100"/>
+              <w:bottom w:type="dxa" w:w="60"/>
+              <w:right w:type="dxa" w:w="100"/>
+            </w:tcMar>
+          </w:tcPr>
+          <w:p>
+            <w:r>
+              <w:rPr>
+                <w:rFonts w:ascii="Times New Roman" w:cs="Times New Roman" w:eastAsia="標楷體" w:hAnsi="Times New Roman"/>
+                <w:b w:val="false"/>
+                <w:bCs w:val="false"/>
+                <w:sz w:val="22"/>
+                <w:szCs w:val="22"/>
+              </w:rPr>
+              <w:t xml:space="preserve">病人依賴程度</w:t>
+            </w:r>
+          </w:p>
+        </w:tc>
+        <w:tc>
+          <w:tcPr>
+            <w:tcW w:type="dxa" w:w="3600"/>
+            <w:tcBorders>
+              <w:top w:val="single" w:color="999999" w:sz="4"/>
+              <w:left w:val="single" w:color="999999" w:sz="4"/>
+              <w:bottom w:val="single" w:color="999999" w:sz="4"/>
+              <w:right w:val="single" w:color="999999" w:sz="4"/>
+            </w:tcBorders>
+            <w:tcMar>
+              <w:top w:type="dxa" w:w="60"/>
+              <w:left w:type="dxa" w:w="100"/>
+              <w:bottom w:type="dxa" w:w="60"/>
+              <w:right w:type="dxa" w:w="100"/>
+            </w:tcMar>
+          </w:tcPr>
+          <w:p>
+            <w:r>
+              <w:rPr>
+                <w:rFonts w:ascii="Times New Roman" w:cs="Times New Roman" w:eastAsia="標楷體" w:hAnsi="Times New Roman"/>
+                <w:b w:val="false"/>
+                <w:bCs w:val="false"/>
+                <w:sz w:val="22"/>
+                <w:szCs w:val="22"/>
+              </w:rPr>
+              <w:t xml:space="preserve">日常活動依賴、跌倒高風險、約束、譫妄或失智躁動的病人，翻身、看守、協助進食與如廁都要時間</w:t>
+            </w:r>
+          </w:p>
+        </w:tc>
+        <w:tc>
+          <w:tcPr>
+            <w:tcW w:type="dxa" w:w="3400"/>
+            <w:tcBorders>
+              <w:top w:val="single" w:color="999999" w:sz="4"/>
+              <w:left w:val="single" w:color="999999" w:sz="4"/>
+              <w:bottom w:val="single" w:color="999999" w:sz="4"/>
+              <w:right w:val="single" w:color="999999" w:sz="4"/>
+            </w:tcBorders>
+            <w:tcMar>
+              <w:top w:type="dxa" w:w="60"/>
+              <w:left w:type="dxa" w:w="100"/>
+              <w:bottom w:type="dxa" w:w="60"/>
+              <w:right w:type="dxa" w:w="100"/>
+            </w:tcMar>
+          </w:tcPr>
+          <w:p>
+            <w:r>
+              <w:rPr>
+                <w:rFonts w:ascii="Times New Roman" w:cs="Times New Roman" w:eastAsia="標楷體" w:hAnsi="Times New Roman"/>
+                <w:b w:val="false"/>
+                <w:bCs w:val="false"/>
+                <w:sz w:val="22"/>
+                <w:szCs w:val="22"/>
+              </w:rPr>
+              <w:t xml:space="preserve">人力不足與漏失照護相關（Ball, BMJ Qual Saf 2014：86% 護理師上一班有照護沒做完）</w:t>
+            </w:r>
+          </w:p>
+        </w:tc>
+      </w:tr>
+      <w:tr>
+        <w:tc>
+          <w:tcPr>
+            <w:tcW w:type="dxa" w:w="2600"/>
+            <w:tcBorders>
+              <w:top w:val="single" w:color="999999" w:sz="4"/>
+              <w:left w:val="single" w:color="999999" w:sz="4"/>
+              <w:bottom w:val="single" w:color="999999" w:sz="4"/>
+              <w:right w:val="single" w:color="999999" w:sz="4"/>
+            </w:tcBorders>
+            <w:tcMar>
+              <w:top w:type="dxa" w:w="60"/>
+              <w:left w:type="dxa" w:w="100"/>
+              <w:bottom w:type="dxa" w:w="60"/>
+              <w:right w:type="dxa" w:w="100"/>
+            </w:tcMar>
+          </w:tcPr>
+          <w:p>
+            <w:r>
+              <w:rPr>
+                <w:rFonts w:ascii="Times New Roman" w:cs="Times New Roman" w:eastAsia="標楷體" w:hAnsi="Times New Roman"/>
+                <w:b w:val="false"/>
+                <w:bCs w:val="false"/>
+                <w:sz w:val="22"/>
+                <w:szCs w:val="22"/>
+              </w:rPr>
+              <w:t xml:space="preserve">病情變化</w:t>
+            </w:r>
+          </w:p>
+        </w:tc>
+        <w:tc>
+          <w:tcPr>
+            <w:tcW w:type="dxa" w:w="3600"/>
+            <w:tcBorders>
+              <w:top w:val="single" w:color="999999" w:sz="4"/>
+              <w:left w:val="single" w:color="999999" w:sz="4"/>
+              <w:bottom w:val="single" w:color="999999" w:sz="4"/>
+              <w:right w:val="single" w:color="999999" w:sz="4"/>
+            </w:tcBorders>
+            <w:tcMar>
+              <w:top w:type="dxa" w:w="60"/>
+              <w:left w:type="dxa" w:w="100"/>
+              <w:bottom w:type="dxa" w:w="60"/>
+              <w:right w:type="dxa" w:w="100"/>
+            </w:tcMar>
+          </w:tcPr>
+          <w:p>
+            <w:r>
+              <w:rPr>
+                <w:rFonts w:ascii="Times New Roman" w:cs="Times New Roman" w:eastAsia="標楷體" w:hAnsi="Times New Roman"/>
+                <w:b w:val="false"/>
+                <w:bCs w:val="false"/>
+                <w:sz w:val="22"/>
+                <w:szCs w:val="22"/>
+              </w:rPr>
+              <w:t xml:space="preserve">早期預警分數達警示值、密集測量生命徵象、快速反應小組呼叫</w:t>
+            </w:r>
+          </w:p>
+        </w:tc>
+        <w:tc>
+          <w:tcPr>
+            <w:tcW w:type="dxa" w:w="3400"/>
+            <w:tcBorders>
+              <w:top w:val="single" w:color="999999" w:sz="4"/>
+              <w:left w:val="single" w:color="999999" w:sz="4"/>
+              <w:bottom w:val="single" w:color="999999" w:sz="4"/>
+              <w:right w:val="single" w:color="999999" w:sz="4"/>
+            </w:tcBorders>
+            <w:tcMar>
+              <w:top w:type="dxa" w:w="60"/>
+              <w:left w:type="dxa" w:w="100"/>
+              <w:bottom w:type="dxa" w:w="60"/>
+              <w:right w:type="dxa" w:w="100"/>
+            </w:tcMar>
+          </w:tcPr>
+          <w:p>
+            <w:r>
+              <w:rPr>
+                <w:rFonts w:ascii="Times New Roman" w:cs="Times New Roman" w:eastAsia="標楷體" w:hAnsi="Times New Roman"/>
+                <w:b w:val="false"/>
+                <w:bCs w:val="false"/>
+                <w:sz w:val="22"/>
+                <w:szCs w:val="22"/>
+              </w:rPr>
+              <w:t xml:space="preserve">人力不足與死亡相關（Aiken, Lancet 2014）</w:t>
+            </w:r>
+          </w:p>
+        </w:tc>
+      </w:tr>
+    </w:tbl>
+    <w:p>
+      <w:pPr>
+        <w:pStyle w:val="ListParagraph"/>
+        <w:numPr>
+          <w:ilvl w:val="0"/>
+          <w:numId w:val="2"/>
+        </w:numPr>
+        <w:spacing w:after="60" w:line="320"/>
+      </w:pPr>
+      <w:r>
+        <w:rPr>
+          <w:rFonts w:ascii="Times New Roman" w:cs="Times New Roman" w:eastAsia="標楷體" w:hAnsi="Times New Roman"/>
+        </w:rPr>
+        <w:t xml:space="preserve">做法：借用芬蘭 RAFAELA 的 OPC 六面向「架構」（照護協調、呼吸循環與症狀、營養與用藥、衛生與排泄、活動與休息、衛教與情緒支持），決定要從既有資料撈哪些指標；不複製其題目，沒有授權問題。</w:t>
+      </w:r>
+    </w:p>
+    <w:p>
+      <w:pPr>
+        <w:pStyle w:val="ListParagraph"/>
+        <w:numPr>
+          <w:ilvl w:val="0"/>
+          <w:numId w:val="2"/>
+        </w:numPr>
+        <w:spacing w:after="60" w:line="320"/>
+      </w:pPr>
+      <w:r>
+        <w:rPr>
+          <w:rFonts w:ascii="Times New Roman" w:cs="Times New Roman" w:eastAsia="標楷體" w:hAnsi="Times New Roman"/>
+        </w:rPr>
+        <w:t xml:space="preserve">誠實說明：芬蘭研究顯示，依照護強度看負荷只比單看護病比「略佳」（Fagerström, BMJ Open 2018）；儀表板定位是「看見落差」，不是取代護病比。</w:t>
+      </w:r>
+    </w:p>
+    <w:p>
+      <w:pPr>
+        <w:pStyle w:val="ListParagraph"/>
+        <w:numPr>
+          <w:ilvl w:val="0"/>
+          <w:numId w:val="2"/>
+        </w:numPr>
+        <w:spacing w:after="60" w:line="320"/>
+      </w:pPr>
+      <w:r>
+        <w:rPr>
+          <w:rFonts w:ascii="Times New Roman" w:cs="Times New Roman" w:eastAsia="標楷體" w:hAnsi="Times New Roman"/>
+        </w:rPr>
+        <w:t xml:space="preserve">內科病房之間互比、外科病房之間互比；內外科照護型態不同，不互比。</w:t>
+      </w:r>
+    </w:p>
+    <w:p>
+      <w:pPr>
+        <w:pStyle w:val="ListParagraph"/>
+        <w:numPr>
+          <w:ilvl w:val="0"/>
+          <w:numId w:val="2"/>
+        </w:numPr>
+        <w:spacing w:after="60" w:line="320"/>
+      </w:pPr>
+      <w:r>
+        <w:rPr>
+          <w:rFonts w:ascii="Times New Roman" w:cs="Times New Roman" w:eastAsia="標楷體" w:hAnsi="Times New Roman"/>
+        </w:rPr>
+        <w:t xml:space="preserve">選配（請各位主管決定）：交班時一鍵自評「本班負荷 −3 到 +3」，可讓儀表板數字對照護理師實際感受；但會增加填寫。</w:t>
+      </w:r>
+    </w:p>
+    <w:p>
+      <w:pPr>
+        <w:spacing w:after="100" w:before="200"/>
+      </w:pPr>
+      <w:r>
+        <w:rPr>
+          <w:rFonts w:ascii="Times New Roman" w:cs="Times New Roman" w:eastAsia="標楷體" w:hAnsi="Times New Roman"/>
+          <w:b/>
+          <w:bCs/>
+          <w:sz w:val="28"/>
+          <w:szCs w:val="28"/>
+        </w:rPr>
+        <w:t xml:space="preserve">八、護理負荷儀表板構想（串接醫囑與護理紀錄，不增加填寫）</w:t>
       </w:r>
     </w:p>
     <w:tbl>
@@ -2075,7 +2531,7 @@
                 <w:sz w:val="22"/>
                 <w:szCs w:val="22"/>
               </w:rPr>
-              <w:t xml:space="preserve">約束、隔離、高跌倒風險、日常活動依賴、翻身紀錄的病人數</w:t>
+              <w:t xml:space="preserve">約束、隔離、高跌倒風險、日常活動依賴、翻身紀錄的病人數；早期預警分數達警示值人數</w:t>
             </w:r>
           </w:p>
         </w:tc>
@@ -2259,7 +2715,7 @@
           <w:sz w:val="28"/>
           <w:szCs w:val="28"/>
         </w:rPr>
-        <w:t xml:space="preserve">八、說法上的提醒</w:t>
+        <w:t xml:space="preserve">九、說法上的提醒</w:t>
       </w:r>
     </w:p>
     <w:p>

</xml_diff>

<commit_message>
Include one-tap shift workload self-rating in dashboard plan
Co-Authored-By: Claude Opus 5.5 <noreply@anthropic.com>
Claude-Session: https://claude.ai/code/session_017upeArPjxTak4ieM8E5m6y
</commit_message>
<xml_diff>
--- a/nursing-workload-proposal/護理主管會議討論稿_v0.1.docx
+++ b/nursing-workload-proposal/護理主管會議討論稿_v0.1.docx
@@ -1154,7 +1154,7 @@
         <w:rPr>
           <w:rFonts w:ascii="Times New Roman" w:cs="Times New Roman" w:eastAsia="標楷體" w:hAnsi="Times New Roman"/>
         </w:rPr>
-        <w:t xml:space="preserve">是否同時提出「護理負荷儀表板」：串接現有醫囑、給藥執行與入出轉資料，按單位、班別呈現每位護理師的工作量；內科病房之間、外科病房之間、內外科加護之間互比。不做研究、不增加護理師填寫。</w:t>
+        <w:t xml:space="preserve">是否同時提出「護理負荷儀表板」：串接現有醫囑、給藥執行與入出轉資料，加上交班一鍵自評，按單位、班別呈現每位護理師的工作量；內科病房之間、外科病房之間、內外科加護之間互比。不做研究。</w:t>
       </w:r>
     </w:p>
     <w:p>
@@ -2082,7 +2082,7 @@
         <w:rPr>
           <w:rFonts w:ascii="Times New Roman" w:cs="Times New Roman" w:eastAsia="標楷體" w:hAnsi="Times New Roman"/>
         </w:rPr>
-        <w:t xml:space="preserve">選配（請各位主管決定）：交班時一鍵自評「本班負荷 −3 到 +3」，可讓儀表板數字對照護理師實際感受；但會增加填寫。</w:t>
+        <w:t xml:space="preserve">納入交班一鍵自評（病房與加護病房都做）：每位護理師交班時點選「本班負荷 −3 到 +3」（0＝剛好），可再點選主要原因（入出院多／病人依賴高／病情變化／人手不足／其他）。只需數秒，讓儀表板數字能對照護理師的實際感受。</w:t>
       </w:r>
     </w:p>
     <w:p>
@@ -2097,7 +2097,7 @@
           <w:sz w:val="28"/>
           <w:szCs w:val="28"/>
         </w:rPr>
-        <w:t xml:space="preserve">八、護理負荷儀表板構想（串接醫囑與護理紀錄，不增加填寫）</w:t>
+        <w:t xml:space="preserve">八、護理負荷儀表板構想（串接醫囑與護理紀錄＋交班一鍵自評）</w:t>
       </w:r>
     </w:p>
     <w:tbl>
@@ -2654,6 +2654,95 @@
           </w:p>
         </w:tc>
       </w:tr>
+      <w:tr>
+        <w:tc>
+          <w:tcPr>
+            <w:tcW w:type="dxa" w:w="3000"/>
+            <w:tcBorders>
+              <w:top w:val="single" w:color="999999" w:sz="4"/>
+              <w:left w:val="single" w:color="999999" w:sz="4"/>
+              <w:bottom w:val="single" w:color="999999" w:sz="4"/>
+              <w:right w:val="single" w:color="999999" w:sz="4"/>
+            </w:tcBorders>
+            <w:tcMar>
+              <w:top w:type="dxa" w:w="60"/>
+              <w:left w:type="dxa" w:w="100"/>
+              <w:bottom w:type="dxa" w:w="60"/>
+              <w:right w:type="dxa" w:w="100"/>
+            </w:tcMar>
+          </w:tcPr>
+          <w:p>
+            <w:r>
+              <w:rPr>
+                <w:rFonts w:ascii="Times New Roman" w:cs="Times New Roman" w:eastAsia="標楷體" w:hAnsi="Times New Roman"/>
+                <w:b w:val="false"/>
+                <w:bCs w:val="false"/>
+                <w:sz w:val="22"/>
+                <w:szCs w:val="22"/>
+              </w:rPr>
+              <w:t xml:space="preserve">交班一鍵自評（新增）</w:t>
+            </w:r>
+          </w:p>
+        </w:tc>
+        <w:tc>
+          <w:tcPr>
+            <w:tcW w:type="dxa" w:w="3600"/>
+            <w:tcBorders>
+              <w:top w:val="single" w:color="999999" w:sz="4"/>
+              <w:left w:val="single" w:color="999999" w:sz="4"/>
+              <w:bottom w:val="single" w:color="999999" w:sz="4"/>
+              <w:right w:val="single" w:color="999999" w:sz="4"/>
+            </w:tcBorders>
+            <w:tcMar>
+              <w:top w:type="dxa" w:w="60"/>
+              <w:left w:type="dxa" w:w="100"/>
+              <w:bottom w:type="dxa" w:w="60"/>
+              <w:right w:type="dxa" w:w="100"/>
+            </w:tcMar>
+          </w:tcPr>
+          <w:p>
+            <w:r>
+              <w:rPr>
+                <w:rFonts w:ascii="Times New Roman" w:cs="Times New Roman" w:eastAsia="標楷體" w:hAnsi="Times New Roman"/>
+                <w:b w:val="false"/>
+                <w:bCs w:val="false"/>
+                <w:sz w:val="22"/>
+                <w:szCs w:val="22"/>
+              </w:rPr>
+              <w:t xml:space="preserve">本班負荷 −3 到 +3 的分布；主要原因的比例</w:t>
+            </w:r>
+          </w:p>
+        </w:tc>
+        <w:tc>
+          <w:tcPr>
+            <w:tcW w:type="dxa" w:w="3000"/>
+            <w:tcBorders>
+              <w:top w:val="single" w:color="999999" w:sz="4"/>
+              <w:left w:val="single" w:color="999999" w:sz="4"/>
+              <w:bottom w:val="single" w:color="999999" w:sz="4"/>
+              <w:right w:val="single" w:color="999999" w:sz="4"/>
+            </w:tcBorders>
+            <w:tcMar>
+              <w:top w:type="dxa" w:w="60"/>
+              <w:left w:type="dxa" w:w="100"/>
+              <w:bottom w:type="dxa" w:w="60"/>
+              <w:right w:type="dxa" w:w="100"/>
+            </w:tcMar>
+          </w:tcPr>
+          <w:p>
+            <w:r>
+              <w:rPr>
+                <w:rFonts w:ascii="Times New Roman" w:cs="Times New Roman" w:eastAsia="標楷體" w:hAnsi="Times New Roman"/>
+                <w:b w:val="false"/>
+                <w:bCs w:val="false"/>
+                <w:sz w:val="22"/>
+                <w:szCs w:val="22"/>
+              </w:rPr>
+              <w:t xml:space="preserve">對照客觀數字；只看單位、班別，不做個人考核</w:t>
+            </w:r>
+          </w:p>
+        </w:tc>
+      </w:tr>
     </w:tbl>
     <w:p>
       <w:pPr>
@@ -2701,6 +2790,22 @@
           <w:rFonts w:ascii="Times New Roman" w:cs="Times New Roman" w:eastAsia="標楷體" w:hAnsi="Times New Roman"/>
         </w:rPr>
         <w:t xml:space="preserve">需要資訊室協助撈取資料；以單位、班別彙總呈現，不含病人個資。</w:t>
+      </w:r>
+    </w:p>
+    <w:p>
+      <w:pPr>
+        <w:pStyle w:val="ListParagraph"/>
+        <w:numPr>
+          <w:ilvl w:val="0"/>
+          <w:numId w:val="2"/>
+        </w:numPr>
+        <w:spacing w:after="60" w:line="320"/>
+      </w:pPr>
+      <w:r>
+        <w:rPr>
+          <w:rFonts w:ascii="Times New Roman" w:cs="Times New Roman" w:eastAsia="標楷體" w:hAnsi="Times New Roman"/>
+        </w:rPr>
+        <w:t xml:space="preserve">交班自評先以紙本勾選或不含個資的表單試行，待資訊室將題目放進交班單後改為系統填寫；結果只看單位、班別的分布，不用於個人考核。</w:t>
       </w:r>
     </w:p>
     <w:p>

</xml_diff>

<commit_message>
Document basis and anchors for shift workload self-rating
Co-Authored-By: Claude Opus 5.5 <noreply@anthropic.com>
Claude-Session: https://claude.ai/code/session_017upeArPjxTak4ieM8E5m6y
</commit_message>
<xml_diff>
--- a/nursing-workload-proposal/護理主管會議討論稿_v0.1.docx
+++ b/nursing-workload-proposal/護理主管會議討論稿_v0.1.docx
@@ -2050,9 +2050,521 @@
         <w:rPr>
           <w:rFonts w:ascii="Times New Roman" w:cs="Times New Roman" w:eastAsia="標楷體" w:hAnsi="Times New Roman"/>
         </w:rPr>
-        <w:t xml:space="preserve">誠實說明：芬蘭研究顯示，依照護強度看負荷只比單看護病比「略佳」（Fagerström, BMJ Open 2018）；儀表板定位是「看見落差」，不是取代護病比。</w:t>
-      </w:r>
-    </w:p>
+        <w:t xml:space="preserve">納入交班一鍵自評（病房與加護病房都做）：每位護理師交班時點選「本班負荷 −3 到 +3」（0＝剛好），可再點選主要原因（入出院多／病人依賴高／病情變化／人手不足／其他）。只需數秒，讓儀表板數字能對照護理師的實際感受。</w:t>
+      </w:r>
+    </w:p>
+    <w:p>
+      <w:pPr>
+        <w:spacing w:after="80" w:line="340"/>
+      </w:pPr>
+      <w:r>
+        <w:rPr>
+          <w:rFonts w:ascii="Times New Roman" w:cs="Times New Roman" w:eastAsia="標楷體" w:hAnsi="Times New Roman"/>
+          <w:sz w:val="22"/>
+          <w:szCs w:val="22"/>
+        </w:rPr>
+        <w:t xml:space="preserve">交班自評的依據與錨點：量尺參考芬蘭 RAFAELA 系統中的 PAONCIL（Professional Assessment of Optimal Nursing Care Intensity Level）概念：護理師逐班以 −3 到 +3 評估負荷，0 代表「最適」；累積數週後與照護量對照，可求出各單位的適當負荷（Rauhala &amp; Fagerström, J Adv Nurs 2004）。PAONCIL 屬授權工具，以下錨點文字為本院自行撰寫，不得稱為 PAONCIL。</w:t>
+      </w:r>
+    </w:p>
+    <w:tbl>
+      <w:tblPr>
+        <w:tblW w:type="dxa" w:w="9600"/>
+        <w:tblBorders>
+          <w:top w:val="single" w:color="auto" w:sz="4"/>
+          <w:left w:val="single" w:color="auto" w:sz="4"/>
+          <w:bottom w:val="single" w:color="auto" w:sz="4"/>
+          <w:right w:val="single" w:color="auto" w:sz="4"/>
+          <w:insideH w:val="single" w:color="auto" w:sz="4"/>
+          <w:insideV w:val="single" w:color="auto" w:sz="4"/>
+        </w:tblBorders>
+      </w:tblPr>
+      <w:tblGrid>
+        <w:gridCol w:w="1000"/>
+        <w:gridCol w:w="8600"/>
+      </w:tblGrid>
+      <w:tr>
+        <w:tc>
+          <w:tcPr>
+            <w:tcW w:type="dxa" w:w="1000"/>
+            <w:tcBorders>
+              <w:top w:val="single" w:color="999999" w:sz="4"/>
+              <w:left w:val="single" w:color="999999" w:sz="4"/>
+              <w:bottom w:val="single" w:color="999999" w:sz="4"/>
+              <w:right w:val="single" w:color="999999" w:sz="4"/>
+            </w:tcBorders>
+            <w:shd w:fill="D9E1F2" w:color="auto" w:val="clear"/>
+            <w:tcMar>
+              <w:top w:type="dxa" w:w="60"/>
+              <w:left w:type="dxa" w:w="100"/>
+              <w:bottom w:type="dxa" w:w="60"/>
+              <w:right w:type="dxa" w:w="100"/>
+            </w:tcMar>
+          </w:tcPr>
+          <w:p>
+            <w:r>
+              <w:rPr>
+                <w:rFonts w:ascii="Times New Roman" w:cs="Times New Roman" w:eastAsia="標楷體" w:hAnsi="Times New Roman"/>
+                <w:b/>
+                <w:bCs/>
+                <w:sz w:val="22"/>
+                <w:szCs w:val="22"/>
+              </w:rPr>
+              <w:t xml:space="preserve">分數</w:t>
+            </w:r>
+          </w:p>
+        </w:tc>
+        <w:tc>
+          <w:tcPr>
+            <w:tcW w:type="dxa" w:w="8600"/>
+            <w:tcBorders>
+              <w:top w:val="single" w:color="999999" w:sz="4"/>
+              <w:left w:val="single" w:color="999999" w:sz="4"/>
+              <w:bottom w:val="single" w:color="999999" w:sz="4"/>
+              <w:right w:val="single" w:color="999999" w:sz="4"/>
+            </w:tcBorders>
+            <w:shd w:fill="D9E1F2" w:color="auto" w:val="clear"/>
+            <w:tcMar>
+              <w:top w:type="dxa" w:w="60"/>
+              <w:left w:type="dxa" w:w="100"/>
+              <w:bottom w:type="dxa" w:w="60"/>
+              <w:right w:type="dxa" w:w="100"/>
+            </w:tcMar>
+          </w:tcPr>
+          <w:p>
+            <w:r>
+              <w:rPr>
+                <w:rFonts w:ascii="Times New Roman" w:cs="Times New Roman" w:eastAsia="標楷體" w:hAnsi="Times New Roman"/>
+                <w:b/>
+                <w:bCs/>
+                <w:sz w:val="22"/>
+                <w:szCs w:val="22"/>
+              </w:rPr>
+              <w:t xml:space="preserve">錨點說明（本院自擬，請主管會議修訂）</w:t>
+            </w:r>
+          </w:p>
+        </w:tc>
+      </w:tr>
+      <w:tr>
+        <w:tc>
+          <w:tcPr>
+            <w:tcW w:type="dxa" w:w="1000"/>
+            <w:tcBorders>
+              <w:top w:val="single" w:color="999999" w:sz="4"/>
+              <w:left w:val="single" w:color="999999" w:sz="4"/>
+              <w:bottom w:val="single" w:color="999999" w:sz="4"/>
+              <w:right w:val="single" w:color="999999" w:sz="4"/>
+            </w:tcBorders>
+            <w:tcMar>
+              <w:top w:type="dxa" w:w="60"/>
+              <w:left w:type="dxa" w:w="100"/>
+              <w:bottom w:type="dxa" w:w="60"/>
+              <w:right w:type="dxa" w:w="100"/>
+            </w:tcMar>
+          </w:tcPr>
+          <w:p>
+            <w:r>
+              <w:rPr>
+                <w:rFonts w:ascii="Times New Roman" w:cs="Times New Roman" w:eastAsia="標楷體" w:hAnsi="Times New Roman"/>
+                <w:b w:val="false"/>
+                <w:bCs w:val="false"/>
+                <w:sz w:val="22"/>
+                <w:szCs w:val="22"/>
+              </w:rPr>
+              <w:t xml:space="preserve">+3</w:t>
+            </w:r>
+          </w:p>
+        </w:tc>
+        <w:tc>
+          <w:tcPr>
+            <w:tcW w:type="dxa" w:w="8600"/>
+            <w:tcBorders>
+              <w:top w:val="single" w:color="999999" w:sz="4"/>
+              <w:left w:val="single" w:color="999999" w:sz="4"/>
+              <w:bottom w:val="single" w:color="999999" w:sz="4"/>
+              <w:right w:val="single" w:color="999999" w:sz="4"/>
+            </w:tcBorders>
+            <w:tcMar>
+              <w:top w:type="dxa" w:w="60"/>
+              <w:left w:type="dxa" w:w="100"/>
+              <w:bottom w:type="dxa" w:w="60"/>
+              <w:right w:type="dxa" w:w="100"/>
+            </w:tcMar>
+          </w:tcPr>
+          <w:p>
+            <w:r>
+              <w:rPr>
+                <w:rFonts w:ascii="Times New Roman" w:cs="Times New Roman" w:eastAsia="標楷體" w:hAnsi="Times New Roman"/>
+                <w:b w:val="false"/>
+                <w:bCs w:val="false"/>
+                <w:sz w:val="22"/>
+                <w:szCs w:val="22"/>
+              </w:rPr>
+              <w:t xml:space="preserve">負荷遠超過可承擔：必要照護無法完成或嚴重延遲，擔心病人安全</w:t>
+            </w:r>
+          </w:p>
+        </w:tc>
+      </w:tr>
+      <w:tr>
+        <w:tc>
+          <w:tcPr>
+            <w:tcW w:type="dxa" w:w="1000"/>
+            <w:tcBorders>
+              <w:top w:val="single" w:color="999999" w:sz="4"/>
+              <w:left w:val="single" w:color="999999" w:sz="4"/>
+              <w:bottom w:val="single" w:color="999999" w:sz="4"/>
+              <w:right w:val="single" w:color="999999" w:sz="4"/>
+            </w:tcBorders>
+            <w:tcMar>
+              <w:top w:type="dxa" w:w="60"/>
+              <w:left w:type="dxa" w:w="100"/>
+              <w:bottom w:type="dxa" w:w="60"/>
+              <w:right w:type="dxa" w:w="100"/>
+            </w:tcMar>
+          </w:tcPr>
+          <w:p>
+            <w:r>
+              <w:rPr>
+                <w:rFonts w:ascii="Times New Roman" w:cs="Times New Roman" w:eastAsia="標楷體" w:hAnsi="Times New Roman"/>
+                <w:b w:val="false"/>
+                <w:bCs w:val="false"/>
+                <w:sz w:val="22"/>
+                <w:szCs w:val="22"/>
+              </w:rPr>
+              <w:t xml:space="preserve">+2</w:t>
+            </w:r>
+          </w:p>
+        </w:tc>
+        <w:tc>
+          <w:tcPr>
+            <w:tcW w:type="dxa" w:w="8600"/>
+            <w:tcBorders>
+              <w:top w:val="single" w:color="999999" w:sz="4"/>
+              <w:left w:val="single" w:color="999999" w:sz="4"/>
+              <w:bottom w:val="single" w:color="999999" w:sz="4"/>
+              <w:right w:val="single" w:color="999999" w:sz="4"/>
+            </w:tcBorders>
+            <w:tcMar>
+              <w:top w:type="dxa" w:w="60"/>
+              <w:left w:type="dxa" w:w="100"/>
+              <w:bottom w:type="dxa" w:w="60"/>
+              <w:right w:type="dxa" w:w="100"/>
+            </w:tcMar>
+          </w:tcPr>
+          <w:p>
+            <w:r>
+              <w:rPr>
+                <w:rFonts w:ascii="Times New Roman" w:cs="Times New Roman" w:eastAsia="標楷體" w:hAnsi="Times New Roman"/>
+                <w:b w:val="false"/>
+                <w:bCs w:val="false"/>
+                <w:sz w:val="22"/>
+                <w:szCs w:val="22"/>
+              </w:rPr>
+              <w:t xml:space="preserve">明顯超過：部分照護延遲或簡化，需要加班或他人支援</w:t>
+            </w:r>
+          </w:p>
+        </w:tc>
+      </w:tr>
+      <w:tr>
+        <w:tc>
+          <w:tcPr>
+            <w:tcW w:type="dxa" w:w="1000"/>
+            <w:tcBorders>
+              <w:top w:val="single" w:color="999999" w:sz="4"/>
+              <w:left w:val="single" w:color="999999" w:sz="4"/>
+              <w:bottom w:val="single" w:color="999999" w:sz="4"/>
+              <w:right w:val="single" w:color="999999" w:sz="4"/>
+            </w:tcBorders>
+            <w:tcMar>
+              <w:top w:type="dxa" w:w="60"/>
+              <w:left w:type="dxa" w:w="100"/>
+              <w:bottom w:type="dxa" w:w="60"/>
+              <w:right w:type="dxa" w:w="100"/>
+            </w:tcMar>
+          </w:tcPr>
+          <w:p>
+            <w:r>
+              <w:rPr>
+                <w:rFonts w:ascii="Times New Roman" w:cs="Times New Roman" w:eastAsia="標楷體" w:hAnsi="Times New Roman"/>
+                <w:b w:val="false"/>
+                <w:bCs w:val="false"/>
+                <w:sz w:val="22"/>
+                <w:szCs w:val="22"/>
+              </w:rPr>
+              <w:t xml:space="preserve">+1</w:t>
+            </w:r>
+          </w:p>
+        </w:tc>
+        <w:tc>
+          <w:tcPr>
+            <w:tcW w:type="dxa" w:w="8600"/>
+            <w:tcBorders>
+              <w:top w:val="single" w:color="999999" w:sz="4"/>
+              <w:left w:val="single" w:color="999999" w:sz="4"/>
+              <w:bottom w:val="single" w:color="999999" w:sz="4"/>
+              <w:right w:val="single" w:color="999999" w:sz="4"/>
+            </w:tcBorders>
+            <w:tcMar>
+              <w:top w:type="dxa" w:w="60"/>
+              <w:left w:type="dxa" w:w="100"/>
+              <w:bottom w:type="dxa" w:w="60"/>
+              <w:right w:type="dxa" w:w="100"/>
+            </w:tcMar>
+          </w:tcPr>
+          <w:p>
+            <w:r>
+              <w:rPr>
+                <w:rFonts w:ascii="Times New Roman" w:cs="Times New Roman" w:eastAsia="標楷體" w:hAnsi="Times New Roman"/>
+                <w:b w:val="false"/>
+                <w:bCs w:val="false"/>
+                <w:sz w:val="22"/>
+                <w:szCs w:val="22"/>
+              </w:rPr>
+              <w:t xml:space="preserve">略高：忙碌但完成，休息或用餐時間被壓縮</w:t>
+            </w:r>
+          </w:p>
+        </w:tc>
+      </w:tr>
+      <w:tr>
+        <w:tc>
+          <w:tcPr>
+            <w:tcW w:type="dxa" w:w="1000"/>
+            <w:tcBorders>
+              <w:top w:val="single" w:color="999999" w:sz="4"/>
+              <w:left w:val="single" w:color="999999" w:sz="4"/>
+              <w:bottom w:val="single" w:color="999999" w:sz="4"/>
+              <w:right w:val="single" w:color="999999" w:sz="4"/>
+            </w:tcBorders>
+            <w:tcMar>
+              <w:top w:type="dxa" w:w="60"/>
+              <w:left w:type="dxa" w:w="100"/>
+              <w:bottom w:type="dxa" w:w="60"/>
+              <w:right w:type="dxa" w:w="100"/>
+            </w:tcMar>
+          </w:tcPr>
+          <w:p>
+            <w:r>
+              <w:rPr>
+                <w:rFonts w:ascii="Times New Roman" w:cs="Times New Roman" w:eastAsia="標楷體" w:hAnsi="Times New Roman"/>
+                <w:b w:val="false"/>
+                <w:bCs w:val="false"/>
+                <w:sz w:val="22"/>
+                <w:szCs w:val="22"/>
+              </w:rPr>
+              <w:t xml:space="preserve">0</w:t>
+            </w:r>
+          </w:p>
+        </w:tc>
+        <w:tc>
+          <w:tcPr>
+            <w:tcW w:type="dxa" w:w="8600"/>
+            <w:tcBorders>
+              <w:top w:val="single" w:color="999999" w:sz="4"/>
+              <w:left w:val="single" w:color="999999" w:sz="4"/>
+              <w:bottom w:val="single" w:color="999999" w:sz="4"/>
+              <w:right w:val="single" w:color="999999" w:sz="4"/>
+            </w:tcBorders>
+            <w:tcMar>
+              <w:top w:type="dxa" w:w="60"/>
+              <w:left w:type="dxa" w:w="100"/>
+              <w:bottom w:type="dxa" w:w="60"/>
+              <w:right w:type="dxa" w:w="100"/>
+            </w:tcMar>
+          </w:tcPr>
+          <w:p>
+            <w:r>
+              <w:rPr>
+                <w:rFonts w:ascii="Times New Roman" w:cs="Times New Roman" w:eastAsia="標楷體" w:hAnsi="Times New Roman"/>
+                <w:b w:val="false"/>
+                <w:bCs w:val="false"/>
+                <w:sz w:val="22"/>
+                <w:szCs w:val="22"/>
+              </w:rPr>
+              <w:t xml:space="preserve">剛好：能依標準完成照護，有正常休息</w:t>
+            </w:r>
+          </w:p>
+        </w:tc>
+      </w:tr>
+      <w:tr>
+        <w:tc>
+          <w:tcPr>
+            <w:tcW w:type="dxa" w:w="1000"/>
+            <w:tcBorders>
+              <w:top w:val="single" w:color="999999" w:sz="4"/>
+              <w:left w:val="single" w:color="999999" w:sz="4"/>
+              <w:bottom w:val="single" w:color="999999" w:sz="4"/>
+              <w:right w:val="single" w:color="999999" w:sz="4"/>
+            </w:tcBorders>
+            <w:tcMar>
+              <w:top w:type="dxa" w:w="60"/>
+              <w:left w:type="dxa" w:w="100"/>
+              <w:bottom w:type="dxa" w:w="60"/>
+              <w:right w:type="dxa" w:w="100"/>
+            </w:tcMar>
+          </w:tcPr>
+          <w:p>
+            <w:r>
+              <w:rPr>
+                <w:rFonts w:ascii="Times New Roman" w:cs="Times New Roman" w:eastAsia="標楷體" w:hAnsi="Times New Roman"/>
+                <w:b w:val="false"/>
+                <w:bCs w:val="false"/>
+                <w:sz w:val="22"/>
+                <w:szCs w:val="22"/>
+              </w:rPr>
+              <w:t xml:space="preserve">−1</w:t>
+            </w:r>
+          </w:p>
+        </w:tc>
+        <w:tc>
+          <w:tcPr>
+            <w:tcW w:type="dxa" w:w="8600"/>
+            <w:tcBorders>
+              <w:top w:val="single" w:color="999999" w:sz="4"/>
+              <w:left w:val="single" w:color="999999" w:sz="4"/>
+              <w:bottom w:val="single" w:color="999999" w:sz="4"/>
+              <w:right w:val="single" w:color="999999" w:sz="4"/>
+            </w:tcBorders>
+            <w:tcMar>
+              <w:top w:type="dxa" w:w="60"/>
+              <w:left w:type="dxa" w:w="100"/>
+              <w:bottom w:type="dxa" w:w="60"/>
+              <w:right w:type="dxa" w:w="100"/>
+            </w:tcMar>
+          </w:tcPr>
+          <w:p>
+            <w:r>
+              <w:rPr>
+                <w:rFonts w:ascii="Times New Roman" w:cs="Times New Roman" w:eastAsia="標楷體" w:hAnsi="Times New Roman"/>
+                <w:b w:val="false"/>
+                <w:bCs w:val="false"/>
+                <w:sz w:val="22"/>
+                <w:szCs w:val="22"/>
+              </w:rPr>
+              <w:t xml:space="preserve">略低：有餘裕，可多做衛教或協助同事</w:t>
+            </w:r>
+          </w:p>
+        </w:tc>
+      </w:tr>
+      <w:tr>
+        <w:tc>
+          <w:tcPr>
+            <w:tcW w:type="dxa" w:w="1000"/>
+            <w:tcBorders>
+              <w:top w:val="single" w:color="999999" w:sz="4"/>
+              <w:left w:val="single" w:color="999999" w:sz="4"/>
+              <w:bottom w:val="single" w:color="999999" w:sz="4"/>
+              <w:right w:val="single" w:color="999999" w:sz="4"/>
+            </w:tcBorders>
+            <w:tcMar>
+              <w:top w:type="dxa" w:w="60"/>
+              <w:left w:type="dxa" w:w="100"/>
+              <w:bottom w:type="dxa" w:w="60"/>
+              <w:right w:type="dxa" w:w="100"/>
+            </w:tcMar>
+          </w:tcPr>
+          <w:p>
+            <w:r>
+              <w:rPr>
+                <w:rFonts w:ascii="Times New Roman" w:cs="Times New Roman" w:eastAsia="標楷體" w:hAnsi="Times New Roman"/>
+                <w:b w:val="false"/>
+                <w:bCs w:val="false"/>
+                <w:sz w:val="22"/>
+                <w:szCs w:val="22"/>
+              </w:rPr>
+              <w:t xml:space="preserve">−2</w:t>
+            </w:r>
+          </w:p>
+        </w:tc>
+        <w:tc>
+          <w:tcPr>
+            <w:tcW w:type="dxa" w:w="8600"/>
+            <w:tcBorders>
+              <w:top w:val="single" w:color="999999" w:sz="4"/>
+              <w:left w:val="single" w:color="999999" w:sz="4"/>
+              <w:bottom w:val="single" w:color="999999" w:sz="4"/>
+              <w:right w:val="single" w:color="999999" w:sz="4"/>
+            </w:tcBorders>
+            <w:tcMar>
+              <w:top w:type="dxa" w:w="60"/>
+              <w:left w:type="dxa" w:w="100"/>
+              <w:bottom w:type="dxa" w:w="60"/>
+              <w:right w:type="dxa" w:w="100"/>
+            </w:tcMar>
+          </w:tcPr>
+          <w:p>
+            <w:r>
+              <w:rPr>
+                <w:rFonts w:ascii="Times New Roman" w:cs="Times New Roman" w:eastAsia="標楷體" w:hAnsi="Times New Roman"/>
+                <w:b w:val="false"/>
+                <w:bCs w:val="false"/>
+                <w:sz w:val="22"/>
+                <w:szCs w:val="22"/>
+              </w:rPr>
+              <w:t xml:space="preserve">明顯低：可抽調支援其他單位</w:t>
+            </w:r>
+          </w:p>
+        </w:tc>
+      </w:tr>
+      <w:tr>
+        <w:tc>
+          <w:tcPr>
+            <w:tcW w:type="dxa" w:w="1000"/>
+            <w:tcBorders>
+              <w:top w:val="single" w:color="999999" w:sz="4"/>
+              <w:left w:val="single" w:color="999999" w:sz="4"/>
+              <w:bottom w:val="single" w:color="999999" w:sz="4"/>
+              <w:right w:val="single" w:color="999999" w:sz="4"/>
+            </w:tcBorders>
+            <w:tcMar>
+              <w:top w:type="dxa" w:w="60"/>
+              <w:left w:type="dxa" w:w="100"/>
+              <w:bottom w:type="dxa" w:w="60"/>
+              <w:right w:type="dxa" w:w="100"/>
+            </w:tcMar>
+          </w:tcPr>
+          <w:p>
+            <w:r>
+              <w:rPr>
+                <w:rFonts w:ascii="Times New Roman" w:cs="Times New Roman" w:eastAsia="標楷體" w:hAnsi="Times New Roman"/>
+                <w:b w:val="false"/>
+                <w:bCs w:val="false"/>
+                <w:sz w:val="22"/>
+                <w:szCs w:val="22"/>
+              </w:rPr>
+              <w:t xml:space="preserve">−3</w:t>
+            </w:r>
+          </w:p>
+        </w:tc>
+        <w:tc>
+          <w:tcPr>
+            <w:tcW w:type="dxa" w:w="8600"/>
+            <w:tcBorders>
+              <w:top w:val="single" w:color="999999" w:sz="4"/>
+              <w:left w:val="single" w:color="999999" w:sz="4"/>
+              <w:bottom w:val="single" w:color="999999" w:sz="4"/>
+              <w:right w:val="single" w:color="999999" w:sz="4"/>
+            </w:tcBorders>
+            <w:tcMar>
+              <w:top w:type="dxa" w:w="60"/>
+              <w:left w:type="dxa" w:w="100"/>
+              <w:bottom w:type="dxa" w:w="60"/>
+              <w:right w:type="dxa" w:w="100"/>
+            </w:tcMar>
+          </w:tcPr>
+          <w:p>
+            <w:r>
+              <w:rPr>
+                <w:rFonts w:ascii="Times New Roman" w:cs="Times New Roman" w:eastAsia="標楷體" w:hAnsi="Times New Roman"/>
+                <w:b w:val="false"/>
+                <w:bCs w:val="false"/>
+                <w:sz w:val="22"/>
+                <w:szCs w:val="22"/>
+              </w:rPr>
+              <w:t xml:space="preserve">遠低於可承擔：人力明顯多於所需</w:t>
+            </w:r>
+          </w:p>
+        </w:tc>
+      </w:tr>
+    </w:tbl>
     <w:p>
       <w:pPr>
         <w:pStyle w:val="ListParagraph"/>
@@ -2066,7 +2578,7 @@
         <w:rPr>
           <w:rFonts w:ascii="Times New Roman" w:cs="Times New Roman" w:eastAsia="標楷體" w:hAnsi="Times New Roman"/>
         </w:rPr>
-        <w:t xml:space="preserve">內科病房之間互比、外科病房之間互比；內外科照護型態不同，不互比。</w:t>
+        <w:t xml:space="preserve">為什麼用正負分數：可以同時看到「太重」和「有餘裕」。有餘裕的單位與班別，正好是開床或機動支援的優先選項，也回應院長開床的需求。</w:t>
       </w:r>
     </w:p>
     <w:p>
@@ -2082,7 +2594,39 @@
         <w:rPr>
           <w:rFonts w:ascii="Times New Roman" w:cs="Times New Roman" w:eastAsia="標楷體" w:hAnsi="Times New Roman"/>
         </w:rPr>
-        <w:t xml:space="preserve">納入交班一鍵自評（病房與加護病房都做）：每位護理師交班時點選「本班負荷 −3 到 +3」（0＝剛好），可再點選主要原因（入出院多／病人依賴高／病情變化／人手不足／其他）。只需數秒，讓儀表板數字能對照護理師的實際感受。</w:t>
+        <w:t xml:space="preserve">限制：屬主觀評估，可能系統性偏高；芬蘭也有研究顯示多數單位未達其資料品質門檻。因此只作為對照訊號，不單獨作為員額依據。</w:t>
+      </w:r>
+    </w:p>
+    <w:p>
+      <w:pPr>
+        <w:pStyle w:val="ListParagraph"/>
+        <w:numPr>
+          <w:ilvl w:val="0"/>
+          <w:numId w:val="2"/>
+        </w:numPr>
+        <w:spacing w:after="60" w:line="320"/>
+      </w:pPr>
+      <w:r>
+        <w:rPr>
+          <w:rFonts w:ascii="Times New Roman" w:cs="Times New Roman" w:eastAsia="標楷體" w:hAnsi="Times New Roman"/>
+        </w:rPr>
+        <w:t xml:space="preserve">誠實說明：芬蘭研究顯示，依照護強度看負荷只比單看護病比「略佳」（Fagerström, BMJ Open 2018）；儀表板定位是「看見落差」，不是取代護病比。</w:t>
+      </w:r>
+    </w:p>
+    <w:p>
+      <w:pPr>
+        <w:pStyle w:val="ListParagraph"/>
+        <w:numPr>
+          <w:ilvl w:val="0"/>
+          <w:numId w:val="2"/>
+        </w:numPr>
+        <w:spacing w:after="60" w:line="320"/>
+      </w:pPr>
+      <w:r>
+        <w:rPr>
+          <w:rFonts w:ascii="Times New Roman" w:cs="Times New Roman" w:eastAsia="標楷體" w:hAnsi="Times New Roman"/>
+        </w:rPr>
+        <w:t xml:space="preserve">內科病房之間互比、外科病房之間互比；內外科照護型態不同，不互比。</w:t>
       </w:r>
     </w:p>
     <w:p>

</xml_diff>

<commit_message>
Add review of CCU traffic-light workload scheme
Co-Authored-By: Claude Opus 5.5 <noreply@anthropic.com>
Claude-Session: https://claude.ai/code/session_017upeArPjxTak4ieM8E5m6y
</commit_message>
<xml_diff>
--- a/nursing-workload-proposal/護理主管會議討論稿_v0.1.docx
+++ b/nursing-workload-proposal/護理主管會議討論稿_v0.1.docx
@@ -1629,6 +1629,351 @@
         <w:t xml:space="preserve">近期做法：不另做研究，先用既有資料（TISS、醫囑、給藥執行、入出轉）呈現；NAS 列為日後需要時的選項。</w:t>
       </w:r>
     </w:p>
+    <w:p>
+      <w:pPr>
+        <w:spacing w:after="60" w:line="340"/>
+      </w:pPr>
+      <w:r>
+        <w:rPr>
+          <w:rFonts w:ascii="Times New Roman" w:cs="Times New Roman" w:eastAsia="標楷體" w:hAnsi="Times New Roman"/>
+          <w:b/>
+          <w:bCs/>
+        </w:rPr>
+        <w:t xml:space="preserve">CCU 試行版「護理負荷燈號」（建議作為加護中心第一個試行單位）</w:t>
+      </w:r>
+    </w:p>
+    <w:p>
+      <w:pPr>
+        <w:spacing w:after="80" w:line="340"/>
+      </w:pPr>
+      <w:r>
+        <w:rPr>
+          <w:rFonts w:ascii="Times New Roman" w:cs="Times New Roman" w:eastAsia="標楷體" w:hAnsi="Times New Roman"/>
+          <w:sz w:val="22"/>
+          <w:szCs w:val="22"/>
+        </w:rPr>
+        <w:t xml:space="preserve">每班由小組長判定每床燈號：紅燈 1:1（權重 2.5）、黃燈 1:2（1.25）、綠燈 1:2.5（1.0）。當量床數＝紅×2.5＋黃×1.25＋綠×1；負荷指數＝當量床數÷佔床數；需要人數＝當量床數÷2.5。缺 0.5 人區內調整，缺 ≥1 人跨區支援。</w:t>
+      </w:r>
+    </w:p>
+    <w:tbl>
+      <w:tblPr>
+        <w:tblW w:type="dxa" w:w="9600"/>
+        <w:tblBorders>
+          <w:top w:val="single" w:color="auto" w:sz="4"/>
+          <w:left w:val="single" w:color="auto" w:sz="4"/>
+          <w:bottom w:val="single" w:color="auto" w:sz="4"/>
+          <w:right w:val="single" w:color="auto" w:sz="4"/>
+          <w:insideH w:val="single" w:color="auto" w:sz="4"/>
+          <w:insideV w:val="single" w:color="auto" w:sz="4"/>
+        </w:tblBorders>
+      </w:tblPr>
+      <w:tblGrid>
+        <w:gridCol w:w="4800"/>
+        <w:gridCol w:w="4800"/>
+      </w:tblGrid>
+      <w:tr>
+        <w:tc>
+          <w:tcPr>
+            <w:tcW w:type="dxa" w:w="4800"/>
+            <w:tcBorders>
+              <w:top w:val="single" w:color="999999" w:sz="4"/>
+              <w:left w:val="single" w:color="999999" w:sz="4"/>
+              <w:bottom w:val="single" w:color="999999" w:sz="4"/>
+              <w:right w:val="single" w:color="999999" w:sz="4"/>
+            </w:tcBorders>
+            <w:shd w:fill="D9E1F2" w:color="auto" w:val="clear"/>
+            <w:tcMar>
+              <w:top w:type="dxa" w:w="60"/>
+              <w:left w:type="dxa" w:w="100"/>
+              <w:bottom w:type="dxa" w:w="60"/>
+              <w:right w:type="dxa" w:w="100"/>
+            </w:tcMar>
+          </w:tcPr>
+          <w:p>
+            <w:r>
+              <w:rPr>
+                <w:rFonts w:ascii="Times New Roman" w:cs="Times New Roman" w:eastAsia="標楷體" w:hAnsi="Times New Roman"/>
+                <w:b/>
+                <w:bCs/>
+                <w:sz w:val="22"/>
+                <w:szCs w:val="22"/>
+              </w:rPr>
+              <w:t xml:space="preserve">優點</w:t>
+            </w:r>
+          </w:p>
+        </w:tc>
+        <w:tc>
+          <w:tcPr>
+            <w:tcW w:type="dxa" w:w="4800"/>
+            <w:tcBorders>
+              <w:top w:val="single" w:color="999999" w:sz="4"/>
+              <w:left w:val="single" w:color="999999" w:sz="4"/>
+              <w:bottom w:val="single" w:color="999999" w:sz="4"/>
+              <w:right w:val="single" w:color="999999" w:sz="4"/>
+            </w:tcBorders>
+            <w:shd w:fill="D9E1F2" w:color="auto" w:val="clear"/>
+            <w:tcMar>
+              <w:top w:type="dxa" w:w="60"/>
+              <w:left w:type="dxa" w:w="100"/>
+              <w:bottom w:type="dxa" w:w="60"/>
+              <w:right w:type="dxa" w:w="100"/>
+            </w:tcMar>
+          </w:tcPr>
+          <w:p>
+            <w:r>
+              <w:rPr>
+                <w:rFonts w:ascii="Times New Roman" w:cs="Times New Roman" w:eastAsia="標楷體" w:hAnsi="Times New Roman"/>
+                <w:b/>
+                <w:bCs/>
+                <w:sz w:val="22"/>
+                <w:szCs w:val="22"/>
+              </w:rPr>
+              <w:t xml:space="preserve">建議討論</w:t>
+            </w:r>
+          </w:p>
+        </w:tc>
+      </w:tr>
+      <w:tr>
+        <w:tc>
+          <w:tcPr>
+            <w:tcW w:type="dxa" w:w="4800"/>
+            <w:tcBorders>
+              <w:top w:val="single" w:color="999999" w:sz="4"/>
+              <w:left w:val="single" w:color="999999" w:sz="4"/>
+              <w:bottom w:val="single" w:color="999999" w:sz="4"/>
+              <w:right w:val="single" w:color="999999" w:sz="4"/>
+            </w:tcBorders>
+            <w:tcMar>
+              <w:top w:type="dxa" w:w="60"/>
+              <w:left w:type="dxa" w:w="100"/>
+              <w:bottom w:type="dxa" w:w="60"/>
+              <w:right w:type="dxa" w:w="100"/>
+            </w:tcMar>
+          </w:tcPr>
+          <w:p>
+            <w:r>
+              <w:rPr>
+                <w:rFonts w:ascii="Times New Roman" w:cs="Times New Roman" w:eastAsia="標楷體" w:hAnsi="Times New Roman"/>
+                <w:b w:val="false"/>
+                <w:bCs w:val="false"/>
+                <w:sz w:val="22"/>
+                <w:szCs w:val="22"/>
+              </w:rPr>
+              <w:t xml:space="preserve">正是院長要的「看得到的資料」：每班一個負荷指數，不做研究</w:t>
+            </w:r>
+          </w:p>
+        </w:tc>
+        <w:tc>
+          <w:tcPr>
+            <w:tcW w:type="dxa" w:w="4800"/>
+            <w:tcBorders>
+              <w:top w:val="single" w:color="999999" w:sz="4"/>
+              <w:left w:val="single" w:color="999999" w:sz="4"/>
+              <w:bottom w:val="single" w:color="999999" w:sz="4"/>
+              <w:right w:val="single" w:color="999999" w:sz="4"/>
+            </w:tcBorders>
+            <w:tcMar>
+              <w:top w:type="dxa" w:w="60"/>
+              <w:left w:type="dxa" w:w="100"/>
+              <w:bottom w:type="dxa" w:w="60"/>
+              <w:right w:type="dxa" w:w="100"/>
+            </w:tcMar>
+          </w:tcPr>
+          <w:p>
+            <w:r>
+              <w:rPr>
+                <w:rFonts w:ascii="Times New Roman" w:cs="Times New Roman" w:eastAsia="標楷體" w:hAnsi="Times New Roman"/>
+                <w:b w:val="false"/>
+                <w:bCs w:val="false"/>
+                <w:sz w:val="22"/>
+                <w:szCs w:val="22"/>
+              </w:rPr>
+              <w:t xml:space="preserve">條件多為設備與藥物，會重複 TISS 盲點；建議先以備註勾選蒐集躁動譫妄、多人翻身、隔離、臨終家屬、外出、急救等照護型條件</w:t>
+            </w:r>
+          </w:p>
+        </w:tc>
+      </w:tr>
+      <w:tr>
+        <w:tc>
+          <w:tcPr>
+            <w:tcW w:type="dxa" w:w="4800"/>
+            <w:tcBorders>
+              <w:top w:val="single" w:color="999999" w:sz="4"/>
+              <w:left w:val="single" w:color="999999" w:sz="4"/>
+              <w:bottom w:val="single" w:color="999999" w:sz="4"/>
+              <w:right w:val="single" w:color="999999" w:sz="4"/>
+            </w:tcBorders>
+            <w:tcMar>
+              <w:top w:type="dxa" w:w="60"/>
+              <w:left w:type="dxa" w:w="100"/>
+              <w:bottom w:type="dxa" w:w="60"/>
+              <w:right w:type="dxa" w:w="100"/>
+            </w:tcMar>
+          </w:tcPr>
+          <w:p>
+            <w:r>
+              <w:rPr>
+                <w:rFonts w:ascii="Times New Roman" w:cs="Times New Roman" w:eastAsia="標楷體" w:hAnsi="Times New Roman"/>
+                <w:b w:val="false"/>
+                <w:bCs w:val="false"/>
+                <w:sz w:val="22"/>
+                <w:szCs w:val="22"/>
+              </w:rPr>
+              <w:t xml:space="preserve">補上加護病房沒有「每班標準」的法規空白</w:t>
+            </w:r>
+          </w:p>
+        </w:tc>
+        <w:tc>
+          <w:tcPr>
+            <w:tcW w:type="dxa" w:w="4800"/>
+            <w:tcBorders>
+              <w:top w:val="single" w:color="999999" w:sz="4"/>
+              <w:left w:val="single" w:color="999999" w:sz="4"/>
+              <w:bottom w:val="single" w:color="999999" w:sz="4"/>
+              <w:right w:val="single" w:color="999999" w:sz="4"/>
+            </w:tcBorders>
+            <w:tcMar>
+              <w:top w:type="dxa" w:w="60"/>
+              <w:left w:type="dxa" w:w="100"/>
+              <w:bottom w:type="dxa" w:w="60"/>
+              <w:right w:type="dxa" w:w="100"/>
+            </w:tcMar>
+          </w:tcPr>
+          <w:p>
+            <w:r>
+              <w:rPr>
+                <w:rFonts w:ascii="Times New Roman" w:cs="Times New Roman" w:eastAsia="標楷體" w:hAnsi="Times New Roman"/>
+                <w:b w:val="false"/>
+                <w:bCs w:val="false"/>
+                <w:sz w:val="22"/>
+                <w:szCs w:val="22"/>
+              </w:rPr>
+              <w:t xml:space="preserve">派班規則「黃燈另一床只配綠燈」與公式在黃燈多時不一致；需明定黃燈可否配黃燈，並以整數人數作為啟動依據</w:t>
+            </w:r>
+          </w:p>
+        </w:tc>
+      </w:tr>
+      <w:tr>
+        <w:tc>
+          <w:tcPr>
+            <w:tcW w:type="dxa" w:w="4800"/>
+            <w:tcBorders>
+              <w:top w:val="single" w:color="999999" w:sz="4"/>
+              <w:left w:val="single" w:color="999999" w:sz="4"/>
+              <w:bottom w:val="single" w:color="999999" w:sz="4"/>
+              <w:right w:val="single" w:color="999999" w:sz="4"/>
+            </w:tcBorders>
+            <w:tcMar>
+              <w:top w:type="dxa" w:w="60"/>
+              <w:left w:type="dxa" w:w="100"/>
+              <w:bottom w:type="dxa" w:w="60"/>
+              <w:right w:type="dxa" w:w="100"/>
+            </w:tcMar>
+          </w:tcPr>
+          <w:p>
+            <w:r>
+              <w:rPr>
+                <w:rFonts w:ascii="Times New Roman" w:cs="Times New Roman" w:eastAsia="標楷體" w:hAnsi="Times New Roman"/>
+                <w:b w:val="false"/>
+                <w:bCs w:val="false"/>
+                <w:sz w:val="22"/>
+                <w:szCs w:val="22"/>
+              </w:rPr>
+              <w:t xml:space="preserve">條件客觀，多數可由醫囑、給藥與設備紀錄預填</w:t>
+            </w:r>
+          </w:p>
+        </w:tc>
+        <w:tc>
+          <w:tcPr>
+            <w:tcW w:type="dxa" w:w="4800"/>
+            <w:tcBorders>
+              <w:top w:val="single" w:color="999999" w:sz="4"/>
+              <w:left w:val="single" w:color="999999" w:sz="4"/>
+              <w:bottom w:val="single" w:color="999999" w:sz="4"/>
+              <w:right w:val="single" w:color="999999" w:sz="4"/>
+            </w:tcBorders>
+            <w:tcMar>
+              <w:top w:type="dxa" w:w="60"/>
+              <w:left w:type="dxa" w:w="100"/>
+              <w:bottom w:type="dxa" w:w="60"/>
+              <w:right w:type="dxa" w:w="100"/>
+            </w:tcMar>
+          </w:tcPr>
+          <w:p>
+            <w:r>
+              <w:rPr>
+                <w:rFonts w:ascii="Times New Roman" w:cs="Times New Roman" w:eastAsia="標楷體" w:hAnsi="Times New Roman"/>
+                <w:b w:val="false"/>
+                <w:bCs w:val="false"/>
+                <w:sz w:val="22"/>
+                <w:szCs w:val="22"/>
+              </w:rPr>
+              <w:t xml:space="preserve">權重由目標護病比推導，屬「試行權重」；以交班一鍵自評與備註驗證，不需另做研究</w:t>
+            </w:r>
+          </w:p>
+        </w:tc>
+      </w:tr>
+      <w:tr>
+        <w:tc>
+          <w:tcPr>
+            <w:tcW w:type="dxa" w:w="4800"/>
+            <w:tcBorders>
+              <w:top w:val="single" w:color="999999" w:sz="4"/>
+              <w:left w:val="single" w:color="999999" w:sz="4"/>
+              <w:bottom w:val="single" w:color="999999" w:sz="4"/>
+              <w:right w:val="single" w:color="999999" w:sz="4"/>
+            </w:tcBorders>
+            <w:tcMar>
+              <w:top w:type="dxa" w:w="60"/>
+              <w:left w:type="dxa" w:w="100"/>
+              <w:bottom w:type="dxa" w:w="60"/>
+              <w:right w:type="dxa" w:w="100"/>
+            </w:tcMar>
+          </w:tcPr>
+          <w:p>
+            <w:r>
+              <w:rPr>
+                <w:rFonts w:ascii="Times New Roman" w:cs="Times New Roman" w:eastAsia="標楷體" w:hAnsi="Times New Roman"/>
+                <w:b w:val="false"/>
+                <w:bCs w:val="false"/>
+                <w:sz w:val="22"/>
+                <w:szCs w:val="22"/>
+              </w:rPr>
+              <w:t xml:space="preserve">已有啟動機制與每月呈報指標</w:t>
+            </w:r>
+          </w:p>
+        </w:tc>
+        <w:tc>
+          <w:tcPr>
+            <w:tcW w:type="dxa" w:w="4800"/>
+            <w:tcBorders>
+              <w:top w:val="single" w:color="999999" w:sz="4"/>
+              <w:left w:val="single" w:color="999999" w:sz="4"/>
+              <w:bottom w:val="single" w:color="999999" w:sz="4"/>
+              <w:right w:val="single" w:color="999999" w:sz="4"/>
+            </w:tcBorders>
+            <w:tcMar>
+              <w:top w:type="dxa" w:w="60"/>
+              <w:left w:type="dxa" w:w="100"/>
+              <w:bottom w:type="dxa" w:w="60"/>
+              <w:right w:type="dxa" w:w="100"/>
+            </w:tcMar>
+          </w:tcPr>
+          <w:p>
+            <w:r>
+              <w:rPr>
+                <w:rFonts w:ascii="Times New Roman" w:cs="Times New Roman" w:eastAsia="標楷體" w:hAnsi="Times New Roman"/>
+                <w:b w:val="false"/>
+                <w:bCs w:val="false"/>
+                <w:sz w:val="22"/>
+                <w:szCs w:val="22"/>
+              </w:rPr>
+              <w:t xml:space="preserve">擴大到其他加護病房時：共同架構，紅黃燈條件由各單位自訂並經共識</w:t>
+            </w:r>
+          </w:p>
+        </w:tc>
+      </w:tr>
+    </w:tbl>
     <w:p>
       <w:pPr>
         <w:spacing w:after="100" w:before="200"/>

</xml_diff>

<commit_message>
Draft traffic-light criteria for SICU, MICU, isolation and burn ICUs
Co-Authored-By: Claude Opus 5.5 <noreply@anthropic.com>
Claude-Session: https://claude.ai/code/session_017upeArPjxTak4ieM8E5m6y
</commit_message>
<xml_diff>
--- a/nursing-workload-proposal/護理主管會議討論稿_v0.1.docx
+++ b/nursing-workload-proposal/護理主管會議討論稿_v0.1.docx
@@ -3758,6 +3758,900 @@
           <w:rFonts w:ascii="Times New Roman" w:cs="Times New Roman" w:eastAsia="標楷體" w:hAnsi="Times New Roman"/>
         </w:rPr>
         <w:t xml:space="preserve">文獻與法規目前只經摘要查核，面報引用的條文日期請再確認一次。</w:t>
+      </w:r>
+    </w:p>
+    <w:p>
+      <w:r>
+        <w:br w:type="page"/>
+      </w:r>
+    </w:p>
+    <w:p>
+      <w:pPr>
+        <w:spacing w:after="100" w:before="200"/>
+      </w:pPr>
+      <w:r>
+        <w:rPr>
+          <w:rFonts w:ascii="Times New Roman" w:cs="Times New Roman" w:eastAsia="標楷體" w:hAnsi="Times New Roman"/>
+          <w:b/>
+          <w:bCs/>
+          <w:sz w:val="28"/>
+          <w:szCs w:val="28"/>
+        </w:rPr>
+        <w:t xml:space="preserve">附件：護理負荷燈號由 CCU 拓展到其他加護單位（討論初稿）</w:t>
+      </w:r>
+    </w:p>
+    <w:p>
+      <w:pPr>
+        <w:spacing w:after="80" w:line="340"/>
+      </w:pPr>
+      <w:r>
+        <w:rPr>
+          <w:rFonts w:ascii="Times New Roman" w:cs="Times New Roman" w:eastAsia="標楷體" w:hAnsi="Times New Roman"/>
+          <w:sz w:val="22"/>
+          <w:szCs w:val="22"/>
+        </w:rPr>
+        <w:t xml:space="preserve">共同架構：紅 1:1（2.5）、黃 1:2（1.25）、綠 1:2.5（1.0）；公式與啟動機制沿用 CCU。各單位紅黃燈條件從同樣五類挑選：①器官支持與設備 ②血流動力學與急性處置 ③照護強度 ④流動 ⑤感染防護。標</w:t>
+      </w:r>
+      <w:r>
+        <w:rPr>
+          <w:rFonts w:ascii="Times New Roman" w:cs="Times New Roman" w:eastAsia="標楷體" w:hAnsi="Times New Roman"/>
+          <w:sz w:val="22"/>
+          <w:szCs w:val="22"/>
+          <w:highlight w:val="yellow"/>
+          <w:highlightCs w:val="yellow"/>
+        </w:rPr>
+        <w:t xml:space="preserve">【單位訂定】</w:t>
+      </w:r>
+      <w:r>
+        <w:rPr>
+          <w:rFonts w:ascii="Times New Roman" w:cs="Times New Roman" w:eastAsia="標楷體" w:hAnsi="Times New Roman"/>
+          <w:sz w:val="22"/>
+          <w:szCs w:val="22"/>
+        </w:rPr>
+        <w:t xml:space="preserve">者由各單位共識決定。</w:t>
+      </w:r>
+    </w:p>
+    <w:tbl>
+      <w:tblPr>
+        <w:tblW w:type="dxa" w:w="9600"/>
+        <w:tblBorders>
+          <w:top w:val="single" w:color="auto" w:sz="4"/>
+          <w:left w:val="single" w:color="auto" w:sz="4"/>
+          <w:bottom w:val="single" w:color="auto" w:sz="4"/>
+          <w:right w:val="single" w:color="auto" w:sz="4"/>
+          <w:insideH w:val="single" w:color="auto" w:sz="4"/>
+          <w:insideV w:val="single" w:color="auto" w:sz="4"/>
+        </w:tblBorders>
+      </w:tblPr>
+      <w:tblGrid>
+        <w:gridCol w:w="1700"/>
+        <w:gridCol w:w="3300"/>
+        <w:gridCol w:w="3000"/>
+        <w:gridCol w:w="1600"/>
+      </w:tblGrid>
+      <w:tr>
+        <w:tc>
+          <w:tcPr>
+            <w:tcW w:type="dxa" w:w="1700"/>
+            <w:tcBorders>
+              <w:top w:val="single" w:color="999999" w:sz="4"/>
+              <w:left w:val="single" w:color="999999" w:sz="4"/>
+              <w:bottom w:val="single" w:color="999999" w:sz="4"/>
+              <w:right w:val="single" w:color="999999" w:sz="4"/>
+            </w:tcBorders>
+            <w:shd w:fill="D9E1F2" w:color="auto" w:val="clear"/>
+            <w:tcMar>
+              <w:top w:type="dxa" w:w="60"/>
+              <w:left w:type="dxa" w:w="100"/>
+              <w:bottom w:type="dxa" w:w="60"/>
+              <w:right w:type="dxa" w:w="100"/>
+            </w:tcMar>
+          </w:tcPr>
+          <w:p>
+            <w:r>
+              <w:rPr>
+                <w:rFonts w:ascii="Times New Roman" w:cs="Times New Roman" w:eastAsia="標楷體" w:hAnsi="Times New Roman"/>
+                <w:b/>
+                <w:bCs/>
+                <w:sz w:val="22"/>
+                <w:szCs w:val="22"/>
+              </w:rPr>
+              <w:t xml:space="preserve">適用</w:t>
+            </w:r>
+          </w:p>
+        </w:tc>
+        <w:tc>
+          <w:tcPr>
+            <w:tcW w:type="dxa" w:w="3300"/>
+            <w:tcBorders>
+              <w:top w:val="single" w:color="999999" w:sz="4"/>
+              <w:left w:val="single" w:color="999999" w:sz="4"/>
+              <w:bottom w:val="single" w:color="999999" w:sz="4"/>
+              <w:right w:val="single" w:color="999999" w:sz="4"/>
+            </w:tcBorders>
+            <w:shd w:fill="D9E1F2" w:color="auto" w:val="clear"/>
+            <w:tcMar>
+              <w:top w:type="dxa" w:w="60"/>
+              <w:left w:type="dxa" w:w="100"/>
+              <w:bottom w:type="dxa" w:w="60"/>
+              <w:right w:type="dxa" w:w="100"/>
+            </w:tcMar>
+          </w:tcPr>
+          <w:p>
+            <w:r>
+              <w:rPr>
+                <w:rFonts w:ascii="Times New Roman" w:cs="Times New Roman" w:eastAsia="標楷體" w:hAnsi="Times New Roman"/>
+                <w:b/>
+                <w:bCs/>
+                <w:sz w:val="22"/>
+                <w:szCs w:val="22"/>
+              </w:rPr>
+              <w:t xml:space="preserve">紅燈（例）</w:t>
+            </w:r>
+          </w:p>
+        </w:tc>
+        <w:tc>
+          <w:tcPr>
+            <w:tcW w:type="dxa" w:w="3000"/>
+            <w:tcBorders>
+              <w:top w:val="single" w:color="999999" w:sz="4"/>
+              <w:left w:val="single" w:color="999999" w:sz="4"/>
+              <w:bottom w:val="single" w:color="999999" w:sz="4"/>
+              <w:right w:val="single" w:color="999999" w:sz="4"/>
+            </w:tcBorders>
+            <w:shd w:fill="D9E1F2" w:color="auto" w:val="clear"/>
+            <w:tcMar>
+              <w:top w:type="dxa" w:w="60"/>
+              <w:left w:type="dxa" w:w="100"/>
+              <w:bottom w:type="dxa" w:w="60"/>
+              <w:right w:type="dxa" w:w="100"/>
+            </w:tcMar>
+          </w:tcPr>
+          <w:p>
+            <w:r>
+              <w:rPr>
+                <w:rFonts w:ascii="Times New Roman" w:cs="Times New Roman" w:eastAsia="標楷體" w:hAnsi="Times New Roman"/>
+                <w:b/>
+                <w:bCs/>
+                <w:sz w:val="22"/>
+                <w:szCs w:val="22"/>
+              </w:rPr>
+              <w:t xml:space="preserve">黃燈（例）</w:t>
+            </w:r>
+          </w:p>
+        </w:tc>
+        <w:tc>
+          <w:tcPr>
+            <w:tcW w:type="dxa" w:w="1600"/>
+            <w:tcBorders>
+              <w:top w:val="single" w:color="999999" w:sz="4"/>
+              <w:left w:val="single" w:color="999999" w:sz="4"/>
+              <w:bottom w:val="single" w:color="999999" w:sz="4"/>
+              <w:right w:val="single" w:color="999999" w:sz="4"/>
+            </w:tcBorders>
+            <w:shd w:fill="D9E1F2" w:color="auto" w:val="clear"/>
+            <w:tcMar>
+              <w:top w:type="dxa" w:w="60"/>
+              <w:left w:type="dxa" w:w="100"/>
+              <w:bottom w:type="dxa" w:w="60"/>
+              <w:right w:type="dxa" w:w="100"/>
+            </w:tcMar>
+          </w:tcPr>
+          <w:p>
+            <w:r>
+              <w:rPr>
+                <w:rFonts w:ascii="Times New Roman" w:cs="Times New Roman" w:eastAsia="標楷體" w:hAnsi="Times New Roman"/>
+                <w:b/>
+                <w:bCs/>
+                <w:sz w:val="22"/>
+                <w:szCs w:val="22"/>
+              </w:rPr>
+              <w:t xml:space="preserve">特別設計</w:t>
+            </w:r>
+          </w:p>
+        </w:tc>
+      </w:tr>
+      <w:tr>
+        <w:tc>
+          <w:tcPr>
+            <w:tcW w:type="dxa" w:w="1700"/>
+            <w:tcBorders>
+              <w:top w:val="single" w:color="999999" w:sz="4"/>
+              <w:left w:val="single" w:color="999999" w:sz="4"/>
+              <w:bottom w:val="single" w:color="999999" w:sz="4"/>
+              <w:right w:val="single" w:color="999999" w:sz="4"/>
+            </w:tcBorders>
+            <w:tcMar>
+              <w:top w:type="dxa" w:w="60"/>
+              <w:left w:type="dxa" w:w="100"/>
+              <w:bottom w:type="dxa" w:w="60"/>
+              <w:right w:type="dxa" w:w="100"/>
+            </w:tcMar>
+          </w:tcPr>
+          <w:p>
+            <w:r>
+              <w:rPr>
+                <w:rFonts w:ascii="Times New Roman" w:cs="Times New Roman" w:eastAsia="標楷體" w:hAnsi="Times New Roman"/>
+                <w:b w:val="false"/>
+                <w:bCs w:val="false"/>
+                <w:sz w:val="22"/>
+                <w:szCs w:val="22"/>
+              </w:rPr>
+              <w:t xml:space="preserve">所有加護單位</w:t>
+            </w:r>
+          </w:p>
+        </w:tc>
+        <w:tc>
+          <w:tcPr>
+            <w:tcW w:type="dxa" w:w="3300"/>
+            <w:tcBorders>
+              <w:top w:val="single" w:color="999999" w:sz="4"/>
+              <w:left w:val="single" w:color="999999" w:sz="4"/>
+              <w:bottom w:val="single" w:color="999999" w:sz="4"/>
+              <w:right w:val="single" w:color="999999" w:sz="4"/>
+            </w:tcBorders>
+            <w:tcMar>
+              <w:top w:type="dxa" w:w="60"/>
+              <w:left w:type="dxa" w:w="100"/>
+              <w:bottom w:type="dxa" w:w="60"/>
+              <w:right w:type="dxa" w:w="100"/>
+            </w:tcMar>
+          </w:tcPr>
+          <w:p>
+            <w:r>
+              <w:rPr>
+                <w:rFonts w:ascii="Times New Roman" w:cs="Times New Roman" w:eastAsia="標楷體" w:hAnsi="Times New Roman"/>
+                <w:b w:val="false"/>
+                <w:bCs w:val="false"/>
+                <w:sz w:val="22"/>
+                <w:szCs w:val="22"/>
+              </w:rPr>
+              <w:t xml:space="preserve">本班 CPR／ECPR 或新裝 ECMO；1 小時內 PRBC ≥3U；ECMO／MCS＋CRRT＋≥2 種升壓藥</w:t>
+            </w:r>
+          </w:p>
+        </w:tc>
+        <w:tc>
+          <w:tcPr>
+            <w:tcW w:type="dxa" w:w="3000"/>
+            <w:tcBorders>
+              <w:top w:val="single" w:color="999999" w:sz="4"/>
+              <w:left w:val="single" w:color="999999" w:sz="4"/>
+              <w:bottom w:val="single" w:color="999999" w:sz="4"/>
+              <w:right w:val="single" w:color="999999" w:sz="4"/>
+            </w:tcBorders>
+            <w:tcMar>
+              <w:top w:type="dxa" w:w="60"/>
+              <w:left w:type="dxa" w:w="100"/>
+              <w:bottom w:type="dxa" w:w="60"/>
+              <w:right w:type="dxa" w:w="100"/>
+            </w:tcMar>
+          </w:tcPr>
+          <w:p>
+            <w:r>
+              <w:rPr>
+                <w:rFonts w:ascii="Times New Roman" w:cs="Times New Roman" w:eastAsia="標楷體" w:hAnsi="Times New Roman"/>
+                <w:b w:val="false"/>
+                <w:bCs w:val="false"/>
+                <w:sz w:val="22"/>
+                <w:szCs w:val="22"/>
+              </w:rPr>
+              <w:t xml:space="preserve">任一 ECMO／MCS、CRRT、≥2 種升壓藥、呼吸器＋升壓藥；新入院、術後回室；外出護送；躁動譫妄需看守或約束；臨終與家屬</w:t>
+            </w:r>
+          </w:p>
+        </w:tc>
+        <w:tc>
+          <w:tcPr>
+            <w:tcW w:type="dxa" w:w="1600"/>
+            <w:tcBorders>
+              <w:top w:val="single" w:color="999999" w:sz="4"/>
+              <w:left w:val="single" w:color="999999" w:sz="4"/>
+              <w:bottom w:val="single" w:color="999999" w:sz="4"/>
+              <w:right w:val="single" w:color="999999" w:sz="4"/>
+            </w:tcBorders>
+            <w:tcMar>
+              <w:top w:type="dxa" w:w="60"/>
+              <w:left w:type="dxa" w:w="100"/>
+              <w:bottom w:type="dxa" w:w="60"/>
+              <w:right w:type="dxa" w:w="100"/>
+            </w:tcMar>
+          </w:tcPr>
+          <w:p>
+            <w:r>
+              <w:rPr>
+                <w:rFonts w:ascii="Times New Roman" w:cs="Times New Roman" w:eastAsia="標楷體" w:hAnsi="Times New Roman"/>
+                <w:b w:val="false"/>
+                <w:bCs w:val="false"/>
+                <w:sz w:val="22"/>
+                <w:szCs w:val="22"/>
+              </w:rPr>
+              <w:t xml:space="preserve">升級規則：全套防護隔離、≥4 人翻身或俯臥，升一級（最高紅燈）</w:t>
+            </w:r>
+          </w:p>
+        </w:tc>
+      </w:tr>
+      <w:tr>
+        <w:tc>
+          <w:tcPr>
+            <w:tcW w:type="dxa" w:w="1700"/>
+            <w:tcBorders>
+              <w:top w:val="single" w:color="999999" w:sz="4"/>
+              <w:left w:val="single" w:color="999999" w:sz="4"/>
+              <w:bottom w:val="single" w:color="999999" w:sz="4"/>
+              <w:right w:val="single" w:color="999999" w:sz="4"/>
+            </w:tcBorders>
+            <w:tcMar>
+              <w:top w:type="dxa" w:w="60"/>
+              <w:left w:type="dxa" w:w="100"/>
+              <w:bottom w:type="dxa" w:w="60"/>
+              <w:right w:type="dxa" w:w="100"/>
+            </w:tcMar>
+          </w:tcPr>
+          <w:p>
+            <w:r>
+              <w:rPr>
+                <w:rFonts w:ascii="Times New Roman" w:cs="Times New Roman" w:eastAsia="標楷體" w:hAnsi="Times New Roman"/>
+                <w:b w:val="false"/>
+                <w:bCs w:val="false"/>
+                <w:sz w:val="22"/>
+                <w:szCs w:val="22"/>
+              </w:rPr>
+              <w:t xml:space="preserve">外科加護</w:t>
+            </w:r>
+          </w:p>
+        </w:tc>
+        <w:tc>
+          <w:tcPr>
+            <w:tcW w:type="dxa" w:w="3300"/>
+            <w:tcBorders>
+              <w:top w:val="single" w:color="999999" w:sz="4"/>
+              <w:left w:val="single" w:color="999999" w:sz="4"/>
+              <w:bottom w:val="single" w:color="999999" w:sz="4"/>
+              <w:right w:val="single" w:color="999999" w:sz="4"/>
+            </w:tcBorders>
+            <w:tcMar>
+              <w:top w:type="dxa" w:w="60"/>
+              <w:left w:type="dxa" w:w="100"/>
+              <w:bottom w:type="dxa" w:w="60"/>
+              <w:right w:type="dxa" w:w="100"/>
+            </w:tcMar>
+          </w:tcPr>
+          <w:p>
+            <w:r>
+              <w:rPr>
+                <w:rFonts w:ascii="Times New Roman" w:cs="Times New Roman" w:eastAsia="標楷體" w:hAnsi="Times New Roman"/>
+                <w:b w:val="false"/>
+                <w:bCs w:val="false"/>
+                <w:sz w:val="22"/>
+                <w:szCs w:val="22"/>
+              </w:rPr>
+              <w:t xml:space="preserve">重大手術（如移植</w:t>
+            </w:r>
+            <w:r>
+              <w:rPr>
+                <w:rFonts w:ascii="Times New Roman" w:cs="Times New Roman" w:eastAsia="標楷體" w:hAnsi="Times New Roman"/>
+                <w:b w:val="false"/>
+                <w:bCs w:val="false"/>
+                <w:sz w:val="22"/>
+                <w:szCs w:val="22"/>
+                <w:highlight w:val="yellow"/>
+                <w:highlightCs w:val="yellow"/>
+              </w:rPr>
+              <w:t xml:space="preserve">【單位訂定】</w:t>
+            </w:r>
+            <w:r>
+              <w:rPr>
+                <w:rFonts w:ascii="Times New Roman" w:cs="Times New Roman" w:eastAsia="標楷體" w:hAnsi="Times New Roman"/>
+                <w:b w:val="false"/>
+                <w:bCs w:val="false"/>
+                <w:sz w:val="22"/>
+                <w:szCs w:val="22"/>
+              </w:rPr>
+              <w:t xml:space="preserve">）術後早期；術後出血需再手術或持續輸血</w:t>
+            </w:r>
+          </w:p>
+        </w:tc>
+        <w:tc>
+          <w:tcPr>
+            <w:tcW w:type="dxa" w:w="3000"/>
+            <w:tcBorders>
+              <w:top w:val="single" w:color="999999" w:sz="4"/>
+              <w:left w:val="single" w:color="999999" w:sz="4"/>
+              <w:bottom w:val="single" w:color="999999" w:sz="4"/>
+              <w:right w:val="single" w:color="999999" w:sz="4"/>
+            </w:tcBorders>
+            <w:tcMar>
+              <w:top w:type="dxa" w:w="60"/>
+              <w:left w:type="dxa" w:w="100"/>
+              <w:bottom w:type="dxa" w:w="60"/>
+              <w:right w:type="dxa" w:w="100"/>
+            </w:tcMar>
+          </w:tcPr>
+          <w:p>
+            <w:r>
+              <w:rPr>
+                <w:rFonts w:ascii="Times New Roman" w:cs="Times New Roman" w:eastAsia="標楷體" w:hAnsi="Times New Roman"/>
+                <w:b w:val="false"/>
+                <w:bCs w:val="false"/>
+                <w:sz w:val="22"/>
+                <w:szCs w:val="22"/>
+              </w:rPr>
+              <w:t xml:space="preserve">開放性腹部或大範圍負壓傷口換藥；多管路每小時記錄；脊椎保護翻身</w:t>
+            </w:r>
+          </w:p>
+        </w:tc>
+        <w:tc>
+          <w:tcPr>
+            <w:tcW w:type="dxa" w:w="1600"/>
+            <w:tcBorders>
+              <w:top w:val="single" w:color="999999" w:sz="4"/>
+              <w:left w:val="single" w:color="999999" w:sz="4"/>
+              <w:bottom w:val="single" w:color="999999" w:sz="4"/>
+              <w:right w:val="single" w:color="999999" w:sz="4"/>
+            </w:tcBorders>
+            <w:tcMar>
+              <w:top w:type="dxa" w:w="60"/>
+              <w:left w:type="dxa" w:w="100"/>
+              <w:bottom w:type="dxa" w:w="60"/>
+              <w:right w:type="dxa" w:w="100"/>
+            </w:tcMar>
+          </w:tcPr>
+          <w:p>
+            <w:r>
+              <w:rPr>
+                <w:rFonts w:ascii="Times New Roman" w:cs="Times New Roman" w:eastAsia="標楷體" w:hAnsi="Times New Roman"/>
+                <w:b w:val="false"/>
+                <w:bCs w:val="false"/>
+                <w:sz w:val="22"/>
+                <w:szCs w:val="22"/>
+              </w:rPr>
+              <w:t xml:space="preserve">看白班下午到小夜的回室人次</w:t>
+            </w:r>
+          </w:p>
+        </w:tc>
+      </w:tr>
+      <w:tr>
+        <w:tc>
+          <w:tcPr>
+            <w:tcW w:type="dxa" w:w="1700"/>
+            <w:tcBorders>
+              <w:top w:val="single" w:color="999999" w:sz="4"/>
+              <w:left w:val="single" w:color="999999" w:sz="4"/>
+              <w:bottom w:val="single" w:color="999999" w:sz="4"/>
+              <w:right w:val="single" w:color="999999" w:sz="4"/>
+            </w:tcBorders>
+            <w:tcMar>
+              <w:top w:type="dxa" w:w="60"/>
+              <w:left w:type="dxa" w:w="100"/>
+              <w:bottom w:type="dxa" w:w="60"/>
+              <w:right w:type="dxa" w:w="100"/>
+            </w:tcMar>
+          </w:tcPr>
+          <w:p>
+            <w:r>
+              <w:rPr>
+                <w:rFonts w:ascii="Times New Roman" w:cs="Times New Roman" w:eastAsia="標楷體" w:hAnsi="Times New Roman"/>
+                <w:b w:val="false"/>
+                <w:bCs w:val="false"/>
+                <w:sz w:val="22"/>
+                <w:szCs w:val="22"/>
+              </w:rPr>
+              <w:t xml:space="preserve">內科加護</w:t>
+            </w:r>
+          </w:p>
+        </w:tc>
+        <w:tc>
+          <w:tcPr>
+            <w:tcW w:type="dxa" w:w="3300"/>
+            <w:tcBorders>
+              <w:top w:val="single" w:color="999999" w:sz="4"/>
+              <w:left w:val="single" w:color="999999" w:sz="4"/>
+              <w:bottom w:val="single" w:color="999999" w:sz="4"/>
+              <w:right w:val="single" w:color="999999" w:sz="4"/>
+            </w:tcBorders>
+            <w:tcMar>
+              <w:top w:type="dxa" w:w="60"/>
+              <w:left w:type="dxa" w:w="100"/>
+              <w:bottom w:type="dxa" w:w="60"/>
+              <w:right w:type="dxa" w:w="100"/>
+            </w:tcMar>
+          </w:tcPr>
+          <w:p>
+            <w:r>
+              <w:rPr>
+                <w:rFonts w:ascii="Times New Roman" w:cs="Times New Roman" w:eastAsia="標楷體" w:hAnsi="Times New Roman"/>
+                <w:b w:val="false"/>
+                <w:bCs w:val="false"/>
+                <w:sz w:val="22"/>
+                <w:szCs w:val="22"/>
+              </w:rPr>
+              <w:t xml:space="preserve">ARDS 俯臥合併 ECMO 或 ≥2 種升壓藥；敗血性休克 ≥3 種升壓藥或升壓藥＋CRRT；大量消化道出血</w:t>
+            </w:r>
+          </w:p>
+        </w:tc>
+        <w:tc>
+          <w:tcPr>
+            <w:tcW w:type="dxa" w:w="3000"/>
+            <w:tcBorders>
+              <w:top w:val="single" w:color="999999" w:sz="4"/>
+              <w:left w:val="single" w:color="999999" w:sz="4"/>
+              <w:bottom w:val="single" w:color="999999" w:sz="4"/>
+              <w:right w:val="single" w:color="999999" w:sz="4"/>
+            </w:tcBorders>
+            <w:tcMar>
+              <w:top w:type="dxa" w:w="60"/>
+              <w:left w:type="dxa" w:w="100"/>
+              <w:bottom w:type="dxa" w:w="60"/>
+              <w:right w:type="dxa" w:w="100"/>
+            </w:tcMar>
+          </w:tcPr>
+          <w:p>
+            <w:r>
+              <w:rPr>
+                <w:rFonts w:ascii="Times New Roman" w:cs="Times New Roman" w:eastAsia="標楷體" w:hAnsi="Times New Roman"/>
+                <w:b w:val="false"/>
+                <w:bCs w:val="false"/>
+                <w:sz w:val="22"/>
+                <w:szCs w:val="22"/>
+              </w:rPr>
+              <w:t xml:space="preserve">俯臥中；高濃度氧非侵襲性通氣或高流量氧療；癲癇重積</w:t>
+            </w:r>
+          </w:p>
+        </w:tc>
+        <w:tc>
+          <w:tcPr>
+            <w:tcW w:type="dxa" w:w="1600"/>
+            <w:tcBorders>
+              <w:top w:val="single" w:color="999999" w:sz="4"/>
+              <w:left w:val="single" w:color="999999" w:sz="4"/>
+              <w:bottom w:val="single" w:color="999999" w:sz="4"/>
+              <w:right w:val="single" w:color="999999" w:sz="4"/>
+            </w:tcBorders>
+            <w:tcMar>
+              <w:top w:type="dxa" w:w="60"/>
+              <w:left w:type="dxa" w:w="100"/>
+              <w:bottom w:type="dxa" w:w="60"/>
+              <w:right w:type="dxa" w:w="100"/>
+            </w:tcMar>
+          </w:tcPr>
+          <w:p>
+            <w:r>
+              <w:rPr>
+                <w:rFonts w:ascii="Times New Roman" w:cs="Times New Roman" w:eastAsia="標楷體" w:hAnsi="Times New Roman"/>
+                <w:b w:val="false"/>
+                <w:bCs w:val="false"/>
+                <w:sz w:val="22"/>
+                <w:szCs w:val="22"/>
+              </w:rPr>
+              <w:t xml:space="preserve">照護型條件特別重要</w:t>
+            </w:r>
+          </w:p>
+        </w:tc>
+      </w:tr>
+      <w:tr>
+        <w:tc>
+          <w:tcPr>
+            <w:tcW w:type="dxa" w:w="1700"/>
+            <w:tcBorders>
+              <w:top w:val="single" w:color="999999" w:sz="4"/>
+              <w:left w:val="single" w:color="999999" w:sz="4"/>
+              <w:bottom w:val="single" w:color="999999" w:sz="4"/>
+              <w:right w:val="single" w:color="999999" w:sz="4"/>
+            </w:tcBorders>
+            <w:tcMar>
+              <w:top w:type="dxa" w:w="60"/>
+              <w:left w:type="dxa" w:w="100"/>
+              <w:bottom w:type="dxa" w:w="60"/>
+              <w:right w:type="dxa" w:w="100"/>
+            </w:tcMar>
+          </w:tcPr>
+          <w:p>
+            <w:r>
+              <w:rPr>
+                <w:rFonts w:ascii="Times New Roman" w:cs="Times New Roman" w:eastAsia="標楷體" w:hAnsi="Times New Roman"/>
+                <w:b w:val="false"/>
+                <w:bCs w:val="false"/>
+                <w:sz w:val="22"/>
+                <w:szCs w:val="22"/>
+              </w:rPr>
+              <w:t xml:space="preserve">感染隔離加護</w:t>
+            </w:r>
+          </w:p>
+        </w:tc>
+        <w:tc>
+          <w:tcPr>
+            <w:tcW w:type="dxa" w:w="3300"/>
+            <w:tcBorders>
+              <w:top w:val="single" w:color="999999" w:sz="4"/>
+              <w:left w:val="single" w:color="999999" w:sz="4"/>
+              <w:bottom w:val="single" w:color="999999" w:sz="4"/>
+              <w:right w:val="single" w:color="999999" w:sz="4"/>
+            </w:tcBorders>
+            <w:tcMar>
+              <w:top w:type="dxa" w:w="60"/>
+              <w:left w:type="dxa" w:w="100"/>
+              <w:bottom w:type="dxa" w:w="60"/>
+              <w:right w:type="dxa" w:w="100"/>
+            </w:tcMar>
+          </w:tcPr>
+          <w:p>
+            <w:r>
+              <w:rPr>
+                <w:rFonts w:ascii="Times New Roman" w:cs="Times New Roman" w:eastAsia="標楷體" w:hAnsi="Times New Roman"/>
+                <w:b w:val="false"/>
+                <w:bCs w:val="false"/>
+                <w:sz w:val="22"/>
+                <w:szCs w:val="22"/>
+              </w:rPr>
+              <w:t xml:space="preserve">空氣隔離或負壓病室，合併呼吸器＋升壓藥或俯臥</w:t>
+            </w:r>
+          </w:p>
+        </w:tc>
+        <w:tc>
+          <w:tcPr>
+            <w:tcW w:type="dxa" w:w="3000"/>
+            <w:tcBorders>
+              <w:top w:val="single" w:color="999999" w:sz="4"/>
+              <w:left w:val="single" w:color="999999" w:sz="4"/>
+              <w:bottom w:val="single" w:color="999999" w:sz="4"/>
+              <w:right w:val="single" w:color="999999" w:sz="4"/>
+            </w:tcBorders>
+            <w:tcMar>
+              <w:top w:type="dxa" w:w="60"/>
+              <w:left w:type="dxa" w:w="100"/>
+              <w:bottom w:type="dxa" w:w="60"/>
+              <w:right w:type="dxa" w:w="100"/>
+            </w:tcMar>
+          </w:tcPr>
+          <w:p>
+            <w:r>
+              <w:rPr>
+                <w:rFonts w:ascii="Times New Roman" w:cs="Times New Roman" w:eastAsia="標楷體" w:hAnsi="Times New Roman"/>
+                <w:b w:val="false"/>
+                <w:bCs w:val="false"/>
+                <w:sz w:val="22"/>
+                <w:szCs w:val="22"/>
+              </w:rPr>
+              <w:t xml:space="preserve">所有全套防護隔離病人至少黃燈</w:t>
+            </w:r>
+          </w:p>
+        </w:tc>
+        <w:tc>
+          <w:tcPr>
+            <w:tcW w:type="dxa" w:w="1600"/>
+            <w:tcBorders>
+              <w:top w:val="single" w:color="999999" w:sz="4"/>
+              <w:left w:val="single" w:color="999999" w:sz="4"/>
+              <w:bottom w:val="single" w:color="999999" w:sz="4"/>
+              <w:right w:val="single" w:color="999999" w:sz="4"/>
+            </w:tcBorders>
+            <w:tcMar>
+              <w:top w:type="dxa" w:w="60"/>
+              <w:left w:type="dxa" w:w="100"/>
+              <w:bottom w:type="dxa" w:w="60"/>
+              <w:right w:type="dxa" w:w="100"/>
+            </w:tcMar>
+          </w:tcPr>
+          <w:p>
+            <w:r>
+              <w:rPr>
+                <w:rFonts w:ascii="Times New Roman" w:cs="Times New Roman" w:eastAsia="標楷體" w:hAnsi="Times New Roman"/>
+                <w:b w:val="false"/>
+                <w:bCs w:val="false"/>
+                <w:sz w:val="22"/>
+                <w:szCs w:val="22"/>
+              </w:rPr>
+              <w:t xml:space="preserve">每班另設病室外傳遞、支援功能班，不計入床位權重</w:t>
+            </w:r>
+          </w:p>
+        </w:tc>
+      </w:tr>
+      <w:tr>
+        <w:tc>
+          <w:tcPr>
+            <w:tcW w:type="dxa" w:w="1700"/>
+            <w:tcBorders>
+              <w:top w:val="single" w:color="999999" w:sz="4"/>
+              <w:left w:val="single" w:color="999999" w:sz="4"/>
+              <w:bottom w:val="single" w:color="999999" w:sz="4"/>
+              <w:right w:val="single" w:color="999999" w:sz="4"/>
+            </w:tcBorders>
+            <w:tcMar>
+              <w:top w:type="dxa" w:w="60"/>
+              <w:left w:type="dxa" w:w="100"/>
+              <w:bottom w:type="dxa" w:w="60"/>
+              <w:right w:type="dxa" w:w="100"/>
+            </w:tcMar>
+          </w:tcPr>
+          <w:p>
+            <w:r>
+              <w:rPr>
+                <w:rFonts w:ascii="Times New Roman" w:cs="Times New Roman" w:eastAsia="標楷體" w:hAnsi="Times New Roman"/>
+                <w:b w:val="false"/>
+                <w:bCs w:val="false"/>
+                <w:sz w:val="22"/>
+                <w:szCs w:val="22"/>
+              </w:rPr>
+              <w:t xml:space="preserve">燒傷加護</w:t>
+            </w:r>
+          </w:p>
+        </w:tc>
+        <w:tc>
+          <w:tcPr>
+            <w:tcW w:type="dxa" w:w="3300"/>
+            <w:tcBorders>
+              <w:top w:val="single" w:color="999999" w:sz="4"/>
+              <w:left w:val="single" w:color="999999" w:sz="4"/>
+              <w:bottom w:val="single" w:color="999999" w:sz="4"/>
+              <w:right w:val="single" w:color="999999" w:sz="4"/>
+            </w:tcBorders>
+            <w:tcMar>
+              <w:top w:type="dxa" w:w="60"/>
+              <w:left w:type="dxa" w:w="100"/>
+              <w:bottom w:type="dxa" w:w="60"/>
+              <w:right w:type="dxa" w:w="100"/>
+            </w:tcMar>
+          </w:tcPr>
+          <w:p>
+            <w:r>
+              <w:rPr>
+                <w:rFonts w:ascii="Times New Roman" w:cs="Times New Roman" w:eastAsia="標楷體" w:hAnsi="Times New Roman"/>
+                <w:b w:val="false"/>
+                <w:bCs w:val="false"/>
+                <w:sz w:val="22"/>
+                <w:szCs w:val="22"/>
+              </w:rPr>
+              <w:t xml:space="preserve">復甦期（48 小時內）且 TBSA ≥</w:t>
+            </w:r>
+            <w:r>
+              <w:rPr>
+                <w:rFonts w:ascii="Times New Roman" w:cs="Times New Roman" w:eastAsia="標楷體" w:hAnsi="Times New Roman"/>
+                <w:b w:val="false"/>
+                <w:bCs w:val="false"/>
+                <w:sz w:val="22"/>
+                <w:szCs w:val="22"/>
+                <w:highlight w:val="yellow"/>
+                <w:highlightCs w:val="yellow"/>
+              </w:rPr>
+              <w:t xml:space="preserve">【單位訂定】</w:t>
+            </w:r>
+            <w:r>
+              <w:rPr>
+                <w:rFonts w:ascii="Times New Roman" w:cs="Times New Roman" w:eastAsia="標楷體" w:hAnsi="Times New Roman"/>
+                <w:b w:val="false"/>
+                <w:bCs w:val="false"/>
+                <w:sz w:val="22"/>
+                <w:szCs w:val="22"/>
+              </w:rPr>
+              <w:t xml:space="preserve">%；本班大範圍換藥或水療（≥2 人、≥</w:t>
+            </w:r>
+            <w:r>
+              <w:rPr>
+                <w:rFonts w:ascii="Times New Roman" w:cs="Times New Roman" w:eastAsia="標楷體" w:hAnsi="Times New Roman"/>
+                <w:b w:val="false"/>
+                <w:bCs w:val="false"/>
+                <w:sz w:val="22"/>
+                <w:szCs w:val="22"/>
+                <w:highlight w:val="yellow"/>
+                <w:highlightCs w:val="yellow"/>
+              </w:rPr>
+              <w:t xml:space="preserve">【單位訂定】</w:t>
+            </w:r>
+            <w:r>
+              <w:rPr>
+                <w:rFonts w:ascii="Times New Roman" w:cs="Times New Roman" w:eastAsia="標楷體" w:hAnsi="Times New Roman"/>
+                <w:b w:val="false"/>
+                <w:bCs w:val="false"/>
+                <w:sz w:val="22"/>
+                <w:szCs w:val="22"/>
+              </w:rPr>
+              <w:t xml:space="preserve">小時）；吸入性灼傷合併呼吸器</w:t>
+            </w:r>
+          </w:p>
+        </w:tc>
+        <w:tc>
+          <w:tcPr>
+            <w:tcW w:type="dxa" w:w="3000"/>
+            <w:tcBorders>
+              <w:top w:val="single" w:color="999999" w:sz="4"/>
+              <w:left w:val="single" w:color="999999" w:sz="4"/>
+              <w:bottom w:val="single" w:color="999999" w:sz="4"/>
+              <w:right w:val="single" w:color="999999" w:sz="4"/>
+            </w:tcBorders>
+            <w:tcMar>
+              <w:top w:type="dxa" w:w="60"/>
+              <w:left w:type="dxa" w:w="100"/>
+              <w:bottom w:type="dxa" w:w="60"/>
+              <w:right w:type="dxa" w:w="100"/>
+            </w:tcMar>
+          </w:tcPr>
+          <w:p>
+            <w:r>
+              <w:rPr>
+                <w:rFonts w:ascii="Times New Roman" w:cs="Times New Roman" w:eastAsia="標楷體" w:hAnsi="Times New Roman"/>
+                <w:b w:val="false"/>
+                <w:bCs w:val="false"/>
+                <w:sz w:val="22"/>
+                <w:szCs w:val="22"/>
+              </w:rPr>
+              <w:t xml:space="preserve">過復甦期但本班換藥；植皮術後早期制動；焦痂切開術後肢體監測</w:t>
+            </w:r>
+          </w:p>
+        </w:tc>
+        <w:tc>
+          <w:tcPr>
+            <w:tcW w:type="dxa" w:w="1600"/>
+            <w:tcBorders>
+              <w:top w:val="single" w:color="999999" w:sz="4"/>
+              <w:left w:val="single" w:color="999999" w:sz="4"/>
+              <w:bottom w:val="single" w:color="999999" w:sz="4"/>
+              <w:right w:val="single" w:color="999999" w:sz="4"/>
+            </w:tcBorders>
+            <w:tcMar>
+              <w:top w:type="dxa" w:w="60"/>
+              <w:left w:type="dxa" w:w="100"/>
+              <w:bottom w:type="dxa" w:w="60"/>
+              <w:right w:type="dxa" w:w="100"/>
+            </w:tcMar>
+          </w:tcPr>
+          <w:p>
+            <w:r>
+              <w:rPr>
+                <w:rFonts w:ascii="Times New Roman" w:cs="Times New Roman" w:eastAsia="標楷體" w:hAnsi="Times New Roman"/>
+                <w:b w:val="false"/>
+                <w:bCs w:val="false"/>
+                <w:sz w:val="22"/>
+                <w:szCs w:val="22"/>
+              </w:rPr>
+              <w:t xml:space="preserve">換藥屬事件型：班內升級並記錄時間；法定人力標準待查</w:t>
+            </w:r>
+          </w:p>
+        </w:tc>
+      </w:tr>
+    </w:tbl>
+    <w:p>
+      <w:pPr>
+        <w:pStyle w:val="ListParagraph"/>
+        <w:numPr>
+          <w:ilvl w:val="0"/>
+          <w:numId w:val="2"/>
+        </w:numPr>
+        <w:spacing w:after="60" w:line="320"/>
+      </w:pPr>
+      <w:r>
+        <w:rPr>
+          <w:rFonts w:ascii="Times New Roman" w:cs="Times New Roman" w:eastAsia="標楷體" w:hAnsi="Times New Roman"/>
+        </w:rPr>
+        <w:t xml:space="preserve">跨單位比較前先校準：條件共識、每季匿名案例互評、以交班自評檢查是否漏列負荷。</w:t>
+      </w:r>
+    </w:p>
+    <w:p>
+      <w:pPr>
+        <w:pStyle w:val="ListParagraph"/>
+        <w:numPr>
+          <w:ilvl w:val="0"/>
+          <w:numId w:val="2"/>
+        </w:numPr>
+        <w:spacing w:after="60" w:line="320"/>
+      </w:pPr>
+      <w:r>
+        <w:rPr>
+          <w:rFonts w:ascii="Times New Roman" w:cs="Times New Roman" w:eastAsia="標楷體" w:hAnsi="Times New Roman"/>
+        </w:rPr>
+        <w:t xml:space="preserve">各單位請於下次會議前回覆：現行實際配置、黃燈可否配黃燈、單位專屬條件與門檻（</w:t>
+      </w:r>
+      <w:r>
+        <w:rPr>
+          <w:rFonts w:ascii="Times New Roman" w:cs="Times New Roman" w:eastAsia="標楷體" w:hAnsi="Times New Roman"/>
+          <w:highlight w:val="yellow"/>
+          <w:highlightCs w:val="yellow"/>
+        </w:rPr>
+        <w:t xml:space="preserve">【單位訂定】</w:t>
+      </w:r>
+      <w:r>
+        <w:rPr>
+          <w:rFonts w:ascii="Times New Roman" w:cs="Times New Roman" w:eastAsia="標楷體" w:hAnsi="Times New Roman"/>
+        </w:rPr>
+        <w:t xml:space="preserve">欄位）。</w:t>
       </w:r>
     </w:p>
     <w:sectPr>

</xml_diff>